<commit_message>
Make graphs and writeup
</commit_message>
<xml_diff>
--- a/takehome3/EEL 6616 Take Home 3.docx
+++ b/takehome3/EEL 6616 Take Home 3.docx
@@ -1530,7 +1530,919 @@
         <w:t>Part (b)</w:t>
       </w:r>
     </w:p>
+    <w:p>
+      <w:pPr>
+        <w:ind w:firstLine="720"/>
+        <w:jc w:val="both"/>
+        <w:rPr>
+          <w:rFonts w:eastAsiaTheme="minorEastAsia"/>
+        </w:rPr>
+      </w:pPr>
+      <w:r>
+        <w:fldChar w:fldCharType="begin"/>
+      </w:r>
+      <w:r>
+        <w:instrText xml:space="preserve"> REF _Ref227534028 \h </w:instrText>
+      </w:r>
+      <w:r>
+        <w:instrText xml:space="preserve"> \* MERGEFORMAT </w:instrText>
+      </w:r>
+      <w:r>
+        <w:fldChar w:fldCharType="separate"/>
+      </w:r>
+      <w:r>
+        <w:t xml:space="preserve">Table </w:t>
+      </w:r>
+      <w:r>
+        <w:rPr>
+          <w:noProof/>
+        </w:rPr>
+        <w:t>1</w:t>
+      </w:r>
+      <w:r>
+        <w:fldChar w:fldCharType="end"/>
+      </w:r>
+      <w:r>
+        <w:t xml:space="preserve"> </w:t>
+      </w:r>
+      <w:r>
+        <w:t xml:space="preserve">shows the results of the generalized predictive control with </w:t>
+      </w:r>
+      <m:oMath>
+        <m:r>
+          <w:rPr>
+            <w:rFonts w:ascii="Cambria Math" w:hAnsi="Cambria Math"/>
+          </w:rPr>
+          <m:t>σ=0.01</m:t>
+        </m:r>
+      </m:oMath>
+      <w:r>
+        <w:rPr>
+          <w:rFonts w:eastAsiaTheme="minorEastAsia"/>
+        </w:rPr>
+        <w:t xml:space="preserve"> and </w:t>
+      </w:r>
+      <m:oMath>
+        <m:r>
+          <w:rPr>
+            <w:rFonts w:ascii="Cambria Math" w:eastAsiaTheme="minorEastAsia" w:hAnsi="Cambria Math"/>
+          </w:rPr>
+          <m:t>σ=1</m:t>
+        </m:r>
+      </m:oMath>
+      <w:r>
+        <w:rPr>
+          <w:rFonts w:eastAsiaTheme="minorEastAsia"/>
+        </w:rPr>
+        <w:t xml:space="preserve">. </w:t>
+      </w:r>
+      <w:r>
+        <w:rPr>
+          <w:rFonts w:eastAsiaTheme="minorEastAsia"/>
+        </w:rPr>
+        <w:t xml:space="preserve">Form the plant and model outputs, it can be seen that a controller with </w:t>
+      </w:r>
+      <m:oMath>
+        <m:r>
+          <w:rPr>
+            <w:rFonts w:ascii="Cambria Math" w:eastAsiaTheme="minorEastAsia" w:hAnsi="Cambria Math"/>
+          </w:rPr>
+          <m:t>σ=1</m:t>
+        </m:r>
+      </m:oMath>
+      <w:r>
+        <w:rPr>
+          <w:rFonts w:eastAsiaTheme="minorEastAsia"/>
+        </w:rPr>
+        <w:t xml:space="preserve"> is generally much slower to respond. </w:t>
+      </w:r>
+      <m:oMath>
+        <m:r>
+          <w:rPr>
+            <w:rFonts w:ascii="Cambria Math" w:eastAsiaTheme="minorEastAsia" w:hAnsi="Cambria Math"/>
+          </w:rPr>
+          <m:t>σ</m:t>
+        </m:r>
+      </m:oMath>
+      <w:r>
+        <w:rPr>
+          <w:rFonts w:eastAsiaTheme="minorEastAsia"/>
+        </w:rPr>
+        <w:t xml:space="preserve"> represents a weight on the control input. When the GPC tries to find an optimal value for the control input, higher  </w:t>
+      </w:r>
+      <m:oMath>
+        <m:r>
+          <w:rPr>
+            <w:rFonts w:ascii="Cambria Math" w:eastAsiaTheme="minorEastAsia" w:hAnsi="Cambria Math"/>
+          </w:rPr>
+          <m:t>σ</m:t>
+        </m:r>
+      </m:oMath>
+      <w:r>
+        <w:rPr>
+          <w:rFonts w:eastAsiaTheme="minorEastAsia"/>
+        </w:rPr>
+        <w:t xml:space="preserve"> values will cause the GPC to </w:t>
+      </w:r>
+      <w:r>
+        <w:rPr>
+          <w:rFonts w:eastAsiaTheme="minorEastAsia"/>
+        </w:rPr>
+        <w:t xml:space="preserve">return </w:t>
+      </w:r>
+      <w:r>
+        <w:rPr>
+          <w:rFonts w:eastAsiaTheme="minorEastAsia"/>
+        </w:rPr>
+        <w:t xml:space="preserve">a much lower input value. </w:t>
+      </w:r>
+      <w:r>
+        <w:rPr>
+          <w:rFonts w:eastAsiaTheme="minorEastAsia"/>
+        </w:rPr>
+        <w:t xml:space="preserve">This can be seen in the bottom plots of the table below. For the </w:t>
+      </w:r>
+      <m:oMath>
+        <m:r>
+          <w:rPr>
+            <w:rFonts w:ascii="Cambria Math" w:eastAsiaTheme="minorEastAsia" w:hAnsi="Cambria Math"/>
+          </w:rPr>
+          <m:t>σ=0.01</m:t>
+        </m:r>
+      </m:oMath>
+      <w:r>
+        <w:rPr>
+          <w:rFonts w:eastAsiaTheme="minorEastAsia"/>
+        </w:rPr>
+        <w:t xml:space="preserve"> case, the control input, </w:t>
+      </w:r>
+      <m:oMath>
+        <m:r>
+          <w:rPr>
+            <w:rFonts w:ascii="Cambria Math" w:eastAsiaTheme="minorEastAsia" w:hAnsi="Cambria Math"/>
+          </w:rPr>
+          <m:t>u</m:t>
+        </m:r>
+      </m:oMath>
+      <w:r>
+        <w:rPr>
+          <w:rFonts w:eastAsiaTheme="minorEastAsia"/>
+        </w:rPr>
+        <w:t xml:space="preserve">, regularly reaches values above </w:t>
+      </w:r>
+      <w:r>
+        <w:rPr>
+          <w:rFonts w:eastAsiaTheme="minorEastAsia"/>
+        </w:rPr>
+        <w:t>0.5 in</w:t>
+      </w:r>
+      <w:r>
+        <w:rPr>
+          <w:rFonts w:eastAsiaTheme="minorEastAsia"/>
+        </w:rPr>
+        <w:t xml:space="preserve"> magnitude while the </w:t>
+      </w:r>
+      <m:oMath>
+        <m:r>
+          <w:rPr>
+            <w:rFonts w:ascii="Cambria Math" w:eastAsiaTheme="minorEastAsia" w:hAnsi="Cambria Math"/>
+          </w:rPr>
+          <m:t>σ=1</m:t>
+        </m:r>
+      </m:oMath>
+      <w:r>
+        <w:rPr>
+          <w:rFonts w:eastAsiaTheme="minorEastAsia"/>
+        </w:rPr>
+        <w:t xml:space="preserve"> scenario never rises above 0.25 in </w:t>
+      </w:r>
+      <w:r>
+        <w:rPr>
+          <w:rFonts w:eastAsiaTheme="minorEastAsia"/>
+        </w:rPr>
+        <w:t>magnitude</w:t>
+      </w:r>
+      <w:r>
+        <w:rPr>
+          <w:rFonts w:eastAsiaTheme="minorEastAsia"/>
+        </w:rPr>
+        <w:t xml:space="preserve">. </w:t>
+      </w:r>
+      <w:r>
+        <w:rPr>
+          <w:rFonts w:eastAsiaTheme="minorEastAsia"/>
+        </w:rPr>
+        <w:t xml:space="preserve">The lower control inputs </w:t>
+      </w:r>
+      <w:r>
+        <w:rPr>
+          <w:rFonts w:eastAsiaTheme="minorEastAsia"/>
+        </w:rPr>
+        <w:t>mean</w:t>
+      </w:r>
+      <w:r>
+        <w:rPr>
+          <w:rFonts w:eastAsiaTheme="minorEastAsia"/>
+        </w:rPr>
+        <w:t xml:space="preserve"> the system can not be moved as much between updates and steps. This is why the plant output responds so much slower for </w:t>
+      </w:r>
+      <m:oMath>
+        <m:r>
+          <w:rPr>
+            <w:rFonts w:ascii="Cambria Math" w:eastAsiaTheme="minorEastAsia" w:hAnsi="Cambria Math"/>
+          </w:rPr>
+          <m:t>σ=1</m:t>
+        </m:r>
+      </m:oMath>
+      <w:r>
+        <w:rPr>
+          <w:rFonts w:eastAsiaTheme="minorEastAsia"/>
+        </w:rPr>
+        <w:t>.</w:t>
+      </w:r>
+    </w:p>
+    <w:p>
+      <w:pPr>
+        <w:ind w:firstLine="720"/>
+        <w:jc w:val="both"/>
+      </w:pPr>
+      <w:r>
+        <w:t xml:space="preserve">The parameter estimates also suffered as a consequence of the slow response. </w:t>
+      </w:r>
+      <w:r>
+        <w:t xml:space="preserve">Because </w:t>
+      </w:r>
+      <m:oMath>
+        <m:sSub>
+          <m:sSubPr>
+            <m:ctrlPr>
+              <w:rPr>
+                <w:rFonts w:ascii="Cambria Math" w:hAnsi="Cambria Math"/>
+                <w:i/>
+              </w:rPr>
+            </m:ctrlPr>
+          </m:sSubPr>
+          <m:e>
+            <m:r>
+              <w:rPr>
+                <w:rFonts w:ascii="Cambria Math" w:hAnsi="Cambria Math"/>
+              </w:rPr>
+              <m:t>y</m:t>
+            </m:r>
+          </m:e>
+          <m:sub>
+            <m:r>
+              <w:rPr>
+                <w:rFonts w:ascii="Cambria Math" w:hAnsi="Cambria Math"/>
+              </w:rPr>
+              <m:t>p</m:t>
+            </m:r>
+          </m:sub>
+        </m:sSub>
+      </m:oMath>
+      <w:r>
+        <w:rPr>
+          <w:rFonts w:eastAsiaTheme="minorEastAsia"/>
+        </w:rPr>
+        <w:t xml:space="preserve"> often had a low magnitude, </w:t>
+      </w:r>
+      <w:r>
+        <w:rPr>
+          <w:rFonts w:eastAsiaTheme="minorEastAsia"/>
+        </w:rPr>
+        <w:t>the RLSFF estimator experienced much less excitation, causing a slower convergence to the parameter values.</w:t>
+      </w:r>
+      <w:r>
+        <w:rPr>
+          <w:rFonts w:eastAsiaTheme="minorEastAsia"/>
+        </w:rPr>
+        <w:t xml:space="preserve"> While the </w:t>
+      </w:r>
+      <m:oMath>
+        <m:r>
+          <w:rPr>
+            <w:rFonts w:ascii="Cambria Math" w:eastAsiaTheme="minorEastAsia" w:hAnsi="Cambria Math"/>
+          </w:rPr>
+          <m:t>σ=1</m:t>
+        </m:r>
+      </m:oMath>
+      <w:r>
+        <w:rPr>
+          <w:rFonts w:eastAsiaTheme="minorEastAsia"/>
+        </w:rPr>
+        <w:t xml:space="preserve"> was able to converge to the true values of </w:t>
+      </w:r>
+      <m:oMath>
+        <m:r>
+          <w:rPr>
+            <w:rFonts w:ascii="Cambria Math" w:eastAsiaTheme="minorEastAsia" w:hAnsi="Cambria Math"/>
+          </w:rPr>
+          <m:t>a</m:t>
+        </m:r>
+      </m:oMath>
+      <w:r>
+        <w:rPr>
+          <w:rFonts w:eastAsiaTheme="minorEastAsia"/>
+        </w:rPr>
+        <w:t xml:space="preserve"> and </w:t>
+      </w:r>
+      <m:oMath>
+        <m:r>
+          <w:rPr>
+            <w:rFonts w:ascii="Cambria Math" w:eastAsiaTheme="minorEastAsia" w:hAnsi="Cambria Math"/>
+          </w:rPr>
+          <m:t>b</m:t>
+        </m:r>
+      </m:oMath>
+      <w:r>
+        <w:rPr>
+          <w:rFonts w:eastAsiaTheme="minorEastAsia"/>
+        </w:rPr>
+        <w:t xml:space="preserve">, the system did take upwards of </w:t>
+      </w:r>
+      <w:r>
+        <w:rPr>
+          <w:rFonts w:eastAsiaTheme="minorEastAsia"/>
+        </w:rPr>
+        <w:t>20-40 more time-</w:t>
+      </w:r>
+      <w:r>
+        <w:rPr>
+          <w:rFonts w:eastAsiaTheme="minorEastAsia"/>
+        </w:rPr>
+        <w:t xml:space="preserve">steps than the </w:t>
+      </w:r>
+      <m:oMath>
+        <m:r>
+          <w:rPr>
+            <w:rFonts w:ascii="Cambria Math" w:eastAsiaTheme="minorEastAsia" w:hAnsi="Cambria Math"/>
+          </w:rPr>
+          <m:t>σ=0.01</m:t>
+        </m:r>
+      </m:oMath>
+      <w:r>
+        <w:rPr>
+          <w:rFonts w:eastAsiaTheme="minorEastAsia"/>
+        </w:rPr>
+        <w:t xml:space="preserve"> scenario.  </w:t>
+      </w:r>
+    </w:p>
+    <w:p>
+      <w:pPr>
+        <w:pStyle w:val="Caption"/>
+        <w:keepNext/>
+        <w:jc w:val="center"/>
+        <w:rPr>
+          <w:i w:val="0"/>
+          <w:iCs w:val="0"/>
+        </w:rPr>
+      </w:pPr>
+      <w:bookmarkStart w:id="0" w:name="_Ref227534028"/>
+      <w:r>
+        <w:rPr>
+          <w:i w:val="0"/>
+          <w:iCs w:val="0"/>
+        </w:rPr>
+        <w:t xml:space="preserve">Table </w:t>
+      </w:r>
+      <w:r>
+        <w:rPr>
+          <w:i w:val="0"/>
+          <w:iCs w:val="0"/>
+        </w:rPr>
+        <w:fldChar w:fldCharType="begin"/>
+      </w:r>
+      <w:r>
+        <w:rPr>
+          <w:i w:val="0"/>
+          <w:iCs w:val="0"/>
+        </w:rPr>
+        <w:instrText xml:space="preserve"> SEQ Table \* ARABIC </w:instrText>
+      </w:r>
+      <w:r>
+        <w:rPr>
+          <w:i w:val="0"/>
+          <w:iCs w:val="0"/>
+        </w:rPr>
+        <w:fldChar w:fldCharType="separate"/>
+      </w:r>
+      <w:r>
+        <w:rPr>
+          <w:i w:val="0"/>
+          <w:iCs w:val="0"/>
+          <w:noProof/>
+        </w:rPr>
+        <w:t>1</w:t>
+      </w:r>
+      <w:r>
+        <w:rPr>
+          <w:i w:val="0"/>
+          <w:iCs w:val="0"/>
+        </w:rPr>
+        <w:fldChar w:fldCharType="end"/>
+      </w:r>
+      <w:bookmarkEnd w:id="0"/>
+      <w:r>
+        <w:rPr>
+          <w:i w:val="0"/>
+          <w:iCs w:val="0"/>
+        </w:rPr>
+        <w:t>: GPC Results</w:t>
+      </w:r>
+    </w:p>
+    <w:tbl>
+      <w:tblPr>
+        <w:tblStyle w:val="PlainTable2"/>
+        <w:tblW w:w="0" w:type="auto"/>
+        <w:jc w:val="center"/>
+        <w:tblLook w:val="04A0" w:firstRow="1" w:lastRow="0" w:firstColumn="1" w:lastColumn="0" w:noHBand="0" w:noVBand="1"/>
+      </w:tblPr>
+      <w:tblGrid>
+        <w:gridCol w:w="4680"/>
+        <w:gridCol w:w="4680"/>
+      </w:tblGrid>
+      <w:tr>
+        <w:trPr>
+          <w:cnfStyle w:val="100000000000" w:firstRow="1" w:lastRow="0" w:firstColumn="0" w:lastColumn="0" w:oddVBand="0" w:evenVBand="0" w:oddHBand="0" w:evenHBand="0" w:firstRowFirstColumn="0" w:firstRowLastColumn="0" w:lastRowFirstColumn="0" w:lastRowLastColumn="0"/>
+          <w:jc w:val="center"/>
+        </w:trPr>
+        <w:tc>
+          <w:tcPr>
+            <w:cnfStyle w:val="001000000000" w:firstRow="0" w:lastRow="0" w:firstColumn="1" w:lastColumn="0" w:oddVBand="0" w:evenVBand="0" w:oddHBand="0" w:evenHBand="0" w:firstRowFirstColumn="0" w:firstRowLastColumn="0" w:lastRowFirstColumn="0" w:lastRowLastColumn="0"/>
+            <w:tcW w:w="4675" w:type="dxa"/>
+          </w:tcPr>
+          <w:p>
+            <m:oMathPara>
+              <m:oMathParaPr>
+                <m:jc m:val="center"/>
+              </m:oMathParaPr>
+              <m:oMath>
+                <m:r>
+                  <m:rPr>
+                    <m:sty m:val="bi"/>
+                  </m:rPr>
+                  <w:rPr>
+                    <w:rFonts w:ascii="Cambria Math" w:hAnsi="Cambria Math"/>
+                  </w:rPr>
+                  <m:t>σ</m:t>
+                </m:r>
+                <m:r>
+                  <m:rPr>
+                    <m:sty m:val="bi"/>
+                  </m:rPr>
+                  <w:rPr>
+                    <w:rFonts w:ascii="Cambria Math" w:hAnsi="Cambria Math"/>
+                  </w:rPr>
+                  <m:t>=0.0</m:t>
+                </m:r>
+                <m:r>
+                  <m:rPr>
+                    <m:sty m:val="bi"/>
+                  </m:rPr>
+                  <w:rPr>
+                    <w:rFonts w:ascii="Cambria Math" w:hAnsi="Cambria Math"/>
+                  </w:rPr>
+                  <m:t>1</m:t>
+                </m:r>
+              </m:oMath>
+            </m:oMathPara>
+          </w:p>
+        </w:tc>
+        <w:tc>
+          <w:tcPr>
+            <w:tcW w:w="4675" w:type="dxa"/>
+          </w:tcPr>
+          <w:p>
+            <w:pPr>
+              <w:cnfStyle w:val="100000000000" w:firstRow="1" w:lastRow="0" w:firstColumn="0" w:lastColumn="0" w:oddVBand="0" w:evenVBand="0" w:oddHBand="0" w:evenHBand="0" w:firstRowFirstColumn="0" w:firstRowLastColumn="0" w:lastRowFirstColumn="0" w:lastRowLastColumn="0"/>
+            </w:pPr>
+            <m:oMathPara>
+              <m:oMath>
+                <m:r>
+                  <m:rPr>
+                    <m:sty m:val="bi"/>
+                  </m:rPr>
+                  <w:rPr>
+                    <w:rFonts w:ascii="Cambria Math" w:hAnsi="Cambria Math"/>
+                  </w:rPr>
+                  <m:t>σ</m:t>
+                </m:r>
+                <m:r>
+                  <m:rPr>
+                    <m:sty m:val="bi"/>
+                  </m:rPr>
+                  <w:rPr>
+                    <w:rFonts w:ascii="Cambria Math" w:hAnsi="Cambria Math"/>
+                  </w:rPr>
+                  <m:t>=1</m:t>
+                </m:r>
+              </m:oMath>
+            </m:oMathPara>
+          </w:p>
+        </w:tc>
+      </w:tr>
+      <w:tr>
+        <w:trPr>
+          <w:cnfStyle w:val="000000100000" w:firstRow="0" w:lastRow="0" w:firstColumn="0" w:lastColumn="0" w:oddVBand="0" w:evenVBand="0" w:oddHBand="1" w:evenHBand="0" w:firstRowFirstColumn="0" w:firstRowLastColumn="0" w:lastRowFirstColumn="0" w:lastRowLastColumn="0"/>
+          <w:jc w:val="center"/>
+        </w:trPr>
+        <w:tc>
+          <w:tcPr>
+            <w:cnfStyle w:val="001000000000" w:firstRow="0" w:lastRow="0" w:firstColumn="1" w:lastColumn="0" w:oddVBand="0" w:evenVBand="0" w:oddHBand="0" w:evenHBand="0" w:firstRowFirstColumn="0" w:firstRowLastColumn="0" w:lastRowFirstColumn="0" w:lastRowLastColumn="0"/>
+            <w:tcW w:w="4675" w:type="dxa"/>
+          </w:tcPr>
+          <w:p>
+            <w:r>
+              <w:rPr>
+                <w:noProof/>
+              </w:rPr>
+              <w:drawing>
+                <wp:inline distT="0" distB="0" distL="0" distR="0" wp14:anchorId="333B1FA7" wp14:editId="390C5166">
+                  <wp:extent cx="2880360" cy="2330631"/>
+                  <wp:effectExtent l="0" t="0" r="0" b="1905"/>
+                  <wp:docPr id="2021574567" name="Picture 11"/>
+                  <wp:cNvGraphicFramePr>
+                    <a:graphicFrameLocks xmlns:a="http://schemas.openxmlformats.org/drawingml/2006/main" noChangeAspect="1"/>
+                  </wp:cNvGraphicFramePr>
+                  <a:graphic xmlns:a="http://schemas.openxmlformats.org/drawingml/2006/main">
+                    <a:graphicData uri="http://schemas.openxmlformats.org/drawingml/2006/picture">
+                      <pic:pic xmlns:pic="http://schemas.openxmlformats.org/drawingml/2006/picture">
+                        <pic:nvPicPr>
+                          <pic:cNvPr id="0" name="Picture 11"/>
+                          <pic:cNvPicPr>
+                            <a:picLocks noChangeAspect="1" noChangeArrowheads="1"/>
+                          </pic:cNvPicPr>
+                        </pic:nvPicPr>
+                        <pic:blipFill>
+                          <a:blip r:embed="rId5" cstate="print">
+                            <a:extLst>
+                              <a:ext uri="{28A0092B-C50C-407E-A947-70E740481C1C}">
+                                <a14:useLocalDpi xmlns:a14="http://schemas.microsoft.com/office/drawing/2010/main" val="0"/>
+                              </a:ext>
+                            </a:extLst>
+                          </a:blip>
+                          <a:srcRect/>
+                          <a:stretch>
+                            <a:fillRect/>
+                          </a:stretch>
+                        </pic:blipFill>
+                        <pic:spPr bwMode="auto">
+                          <a:xfrm>
+                            <a:off x="0" y="0"/>
+                            <a:ext cx="2880360" cy="2330631"/>
+                          </a:xfrm>
+                          <a:prstGeom prst="rect">
+                            <a:avLst/>
+                          </a:prstGeom>
+                          <a:noFill/>
+                          <a:ln>
+                            <a:noFill/>
+                          </a:ln>
+                        </pic:spPr>
+                      </pic:pic>
+                    </a:graphicData>
+                  </a:graphic>
+                </wp:inline>
+              </w:drawing>
+            </w:r>
+          </w:p>
+        </w:tc>
+        <w:tc>
+          <w:tcPr>
+            <w:tcW w:w="4675" w:type="dxa"/>
+          </w:tcPr>
+          <w:p>
+            <w:pPr>
+              <w:cnfStyle w:val="000000100000" w:firstRow="0" w:lastRow="0" w:firstColumn="0" w:lastColumn="0" w:oddVBand="0" w:evenVBand="0" w:oddHBand="1" w:evenHBand="0" w:firstRowFirstColumn="0" w:firstRowLastColumn="0" w:lastRowFirstColumn="0" w:lastRowLastColumn="0"/>
+            </w:pPr>
+            <w:r>
+              <w:rPr>
+                <w:noProof/>
+              </w:rPr>
+              <w:drawing>
+                <wp:inline distT="0" distB="0" distL="0" distR="0" wp14:anchorId="4FD70CA3" wp14:editId="30369559">
+                  <wp:extent cx="2880360" cy="2330631"/>
+                  <wp:effectExtent l="0" t="0" r="0" b="0"/>
+                  <wp:docPr id="1135601639" name="Picture 17"/>
+                  <wp:cNvGraphicFramePr>
+                    <a:graphicFrameLocks xmlns:a="http://schemas.openxmlformats.org/drawingml/2006/main" noChangeAspect="1"/>
+                  </wp:cNvGraphicFramePr>
+                  <a:graphic xmlns:a="http://schemas.openxmlformats.org/drawingml/2006/main">
+                    <a:graphicData uri="http://schemas.openxmlformats.org/drawingml/2006/picture">
+                      <pic:pic xmlns:pic="http://schemas.openxmlformats.org/drawingml/2006/picture">
+                        <pic:nvPicPr>
+                          <pic:cNvPr id="0" name="Picture 17"/>
+                          <pic:cNvPicPr>
+                            <a:picLocks noChangeAspect="1" noChangeArrowheads="1"/>
+                          </pic:cNvPicPr>
+                        </pic:nvPicPr>
+                        <pic:blipFill>
+                          <a:blip r:embed="rId6" cstate="print">
+                            <a:extLst>
+                              <a:ext uri="{28A0092B-C50C-407E-A947-70E740481C1C}">
+                                <a14:useLocalDpi xmlns:a14="http://schemas.microsoft.com/office/drawing/2010/main" val="0"/>
+                              </a:ext>
+                            </a:extLst>
+                          </a:blip>
+                          <a:srcRect/>
+                          <a:stretch>
+                            <a:fillRect/>
+                          </a:stretch>
+                        </pic:blipFill>
+                        <pic:spPr bwMode="auto">
+                          <a:xfrm>
+                            <a:off x="0" y="0"/>
+                            <a:ext cx="2880360" cy="2330631"/>
+                          </a:xfrm>
+                          <a:prstGeom prst="rect">
+                            <a:avLst/>
+                          </a:prstGeom>
+                          <a:noFill/>
+                          <a:ln>
+                            <a:noFill/>
+                          </a:ln>
+                        </pic:spPr>
+                      </pic:pic>
+                    </a:graphicData>
+                  </a:graphic>
+                </wp:inline>
+              </w:drawing>
+            </w:r>
+          </w:p>
+        </w:tc>
+      </w:tr>
+      <w:tr>
+        <w:trPr>
+          <w:jc w:val="center"/>
+        </w:trPr>
+        <w:tc>
+          <w:tcPr>
+            <w:cnfStyle w:val="001000000000" w:firstRow="0" w:lastRow="0" w:firstColumn="1" w:lastColumn="0" w:oddVBand="0" w:evenVBand="0" w:oddHBand="0" w:evenHBand="0" w:firstRowFirstColumn="0" w:firstRowLastColumn="0" w:lastRowFirstColumn="0" w:lastRowLastColumn="0"/>
+            <w:tcW w:w="4675" w:type="dxa"/>
+          </w:tcPr>
+          <w:p>
+            <w:r>
+              <w:rPr>
+                <w:noProof/>
+              </w:rPr>
+              <w:lastRenderedPageBreak/>
+              <w:drawing>
+                <wp:inline distT="0" distB="0" distL="0" distR="0" wp14:anchorId="4D7EBC30" wp14:editId="1BA1EC2F">
+                  <wp:extent cx="2880360" cy="2325053"/>
+                  <wp:effectExtent l="0" t="0" r="0" b="0"/>
+                  <wp:docPr id="1523032061" name="Picture 12"/>
+                  <wp:cNvGraphicFramePr>
+                    <a:graphicFrameLocks xmlns:a="http://schemas.openxmlformats.org/drawingml/2006/main" noChangeAspect="1"/>
+                  </wp:cNvGraphicFramePr>
+                  <a:graphic xmlns:a="http://schemas.openxmlformats.org/drawingml/2006/main">
+                    <a:graphicData uri="http://schemas.openxmlformats.org/drawingml/2006/picture">
+                      <pic:pic xmlns:pic="http://schemas.openxmlformats.org/drawingml/2006/picture">
+                        <pic:nvPicPr>
+                          <pic:cNvPr id="0" name="Picture 12"/>
+                          <pic:cNvPicPr>
+                            <a:picLocks noChangeAspect="1" noChangeArrowheads="1"/>
+                          </pic:cNvPicPr>
+                        </pic:nvPicPr>
+                        <pic:blipFill>
+                          <a:blip r:embed="rId7" cstate="print">
+                            <a:extLst>
+                              <a:ext uri="{28A0092B-C50C-407E-A947-70E740481C1C}">
+                                <a14:useLocalDpi xmlns:a14="http://schemas.microsoft.com/office/drawing/2010/main" val="0"/>
+                              </a:ext>
+                            </a:extLst>
+                          </a:blip>
+                          <a:srcRect/>
+                          <a:stretch>
+                            <a:fillRect/>
+                          </a:stretch>
+                        </pic:blipFill>
+                        <pic:spPr bwMode="auto">
+                          <a:xfrm>
+                            <a:off x="0" y="0"/>
+                            <a:ext cx="2880360" cy="2325053"/>
+                          </a:xfrm>
+                          <a:prstGeom prst="rect">
+                            <a:avLst/>
+                          </a:prstGeom>
+                          <a:noFill/>
+                          <a:ln>
+                            <a:noFill/>
+                          </a:ln>
+                        </pic:spPr>
+                      </pic:pic>
+                    </a:graphicData>
+                  </a:graphic>
+                </wp:inline>
+              </w:drawing>
+            </w:r>
+          </w:p>
+        </w:tc>
+        <w:tc>
+          <w:tcPr>
+            <w:tcW w:w="4675" w:type="dxa"/>
+          </w:tcPr>
+          <w:p>
+            <w:pPr>
+              <w:cnfStyle w:val="000000000000" w:firstRow="0" w:lastRow="0" w:firstColumn="0" w:lastColumn="0" w:oddVBand="0" w:evenVBand="0" w:oddHBand="0" w:evenHBand="0" w:firstRowFirstColumn="0" w:firstRowLastColumn="0" w:lastRowFirstColumn="0" w:lastRowLastColumn="0"/>
+            </w:pPr>
+            <w:r>
+              <w:rPr>
+                <w:noProof/>
+              </w:rPr>
+              <w:drawing>
+                <wp:inline distT="0" distB="0" distL="0" distR="0" wp14:anchorId="63944BDD" wp14:editId="7EFBC42D">
+                  <wp:extent cx="2880360" cy="2325053"/>
+                  <wp:effectExtent l="0" t="0" r="0" b="0"/>
+                  <wp:docPr id="351815403" name="Picture 18"/>
+                  <wp:cNvGraphicFramePr>
+                    <a:graphicFrameLocks xmlns:a="http://schemas.openxmlformats.org/drawingml/2006/main" noChangeAspect="1"/>
+                  </wp:cNvGraphicFramePr>
+                  <a:graphic xmlns:a="http://schemas.openxmlformats.org/drawingml/2006/main">
+                    <a:graphicData uri="http://schemas.openxmlformats.org/drawingml/2006/picture">
+                      <pic:pic xmlns:pic="http://schemas.openxmlformats.org/drawingml/2006/picture">
+                        <pic:nvPicPr>
+                          <pic:cNvPr id="0" name="Picture 18"/>
+                          <pic:cNvPicPr>
+                            <a:picLocks noChangeAspect="1" noChangeArrowheads="1"/>
+                          </pic:cNvPicPr>
+                        </pic:nvPicPr>
+                        <pic:blipFill>
+                          <a:blip r:embed="rId8" cstate="print">
+                            <a:extLst>
+                              <a:ext uri="{28A0092B-C50C-407E-A947-70E740481C1C}">
+                                <a14:useLocalDpi xmlns:a14="http://schemas.microsoft.com/office/drawing/2010/main" val="0"/>
+                              </a:ext>
+                            </a:extLst>
+                          </a:blip>
+                          <a:srcRect/>
+                          <a:stretch>
+                            <a:fillRect/>
+                          </a:stretch>
+                        </pic:blipFill>
+                        <pic:spPr bwMode="auto">
+                          <a:xfrm>
+                            <a:off x="0" y="0"/>
+                            <a:ext cx="2880360" cy="2325053"/>
+                          </a:xfrm>
+                          <a:prstGeom prst="rect">
+                            <a:avLst/>
+                          </a:prstGeom>
+                          <a:noFill/>
+                          <a:ln>
+                            <a:noFill/>
+                          </a:ln>
+                        </pic:spPr>
+                      </pic:pic>
+                    </a:graphicData>
+                  </a:graphic>
+                </wp:inline>
+              </w:drawing>
+            </w:r>
+          </w:p>
+        </w:tc>
+      </w:tr>
+      <w:tr>
+        <w:trPr>
+          <w:cnfStyle w:val="000000100000" w:firstRow="0" w:lastRow="0" w:firstColumn="0" w:lastColumn="0" w:oddVBand="0" w:evenVBand="0" w:oddHBand="1" w:evenHBand="0" w:firstRowFirstColumn="0" w:firstRowLastColumn="0" w:lastRowFirstColumn="0" w:lastRowLastColumn="0"/>
+          <w:jc w:val="center"/>
+        </w:trPr>
+        <w:tc>
+          <w:tcPr>
+            <w:cnfStyle w:val="001000000000" w:firstRow="0" w:lastRow="0" w:firstColumn="1" w:lastColumn="0" w:oddVBand="0" w:evenVBand="0" w:oddHBand="0" w:evenHBand="0" w:firstRowFirstColumn="0" w:firstRowLastColumn="0" w:lastRowFirstColumn="0" w:lastRowLastColumn="0"/>
+            <w:tcW w:w="4675" w:type="dxa"/>
+          </w:tcPr>
+          <w:p>
+            <w:r>
+              <w:rPr>
+                <w:noProof/>
+              </w:rPr>
+              <w:drawing>
+                <wp:inline distT="0" distB="0" distL="0" distR="0" wp14:anchorId="184934E0" wp14:editId="5B58F6AA">
+                  <wp:extent cx="2880360" cy="2304835"/>
+                  <wp:effectExtent l="0" t="0" r="0" b="635"/>
+                  <wp:docPr id="1646242602" name="Picture 13"/>
+                  <wp:cNvGraphicFramePr>
+                    <a:graphicFrameLocks xmlns:a="http://schemas.openxmlformats.org/drawingml/2006/main" noChangeAspect="1"/>
+                  </wp:cNvGraphicFramePr>
+                  <a:graphic xmlns:a="http://schemas.openxmlformats.org/drawingml/2006/main">
+                    <a:graphicData uri="http://schemas.openxmlformats.org/drawingml/2006/picture">
+                      <pic:pic xmlns:pic="http://schemas.openxmlformats.org/drawingml/2006/picture">
+                        <pic:nvPicPr>
+                          <pic:cNvPr id="0" name="Picture 13"/>
+                          <pic:cNvPicPr>
+                            <a:picLocks noChangeAspect="1" noChangeArrowheads="1"/>
+                          </pic:cNvPicPr>
+                        </pic:nvPicPr>
+                        <pic:blipFill>
+                          <a:blip r:embed="rId9" cstate="print">
+                            <a:extLst>
+                              <a:ext uri="{28A0092B-C50C-407E-A947-70E740481C1C}">
+                                <a14:useLocalDpi xmlns:a14="http://schemas.microsoft.com/office/drawing/2010/main" val="0"/>
+                              </a:ext>
+                            </a:extLst>
+                          </a:blip>
+                          <a:srcRect/>
+                          <a:stretch>
+                            <a:fillRect/>
+                          </a:stretch>
+                        </pic:blipFill>
+                        <pic:spPr bwMode="auto">
+                          <a:xfrm>
+                            <a:off x="0" y="0"/>
+                            <a:ext cx="2880360" cy="2304835"/>
+                          </a:xfrm>
+                          <a:prstGeom prst="rect">
+                            <a:avLst/>
+                          </a:prstGeom>
+                          <a:noFill/>
+                          <a:ln>
+                            <a:noFill/>
+                          </a:ln>
+                        </pic:spPr>
+                      </pic:pic>
+                    </a:graphicData>
+                  </a:graphic>
+                </wp:inline>
+              </w:drawing>
+            </w:r>
+          </w:p>
+        </w:tc>
+        <w:tc>
+          <w:tcPr>
+            <w:tcW w:w="4675" w:type="dxa"/>
+          </w:tcPr>
+          <w:p>
+            <w:pPr>
+              <w:cnfStyle w:val="000000100000" w:firstRow="0" w:lastRow="0" w:firstColumn="0" w:lastColumn="0" w:oddVBand="0" w:evenVBand="0" w:oddHBand="1" w:evenHBand="0" w:firstRowFirstColumn="0" w:firstRowLastColumn="0" w:lastRowFirstColumn="0" w:lastRowLastColumn="0"/>
+            </w:pPr>
+            <w:r>
+              <w:rPr>
+                <w:noProof/>
+              </w:rPr>
+              <w:drawing>
+                <wp:inline distT="0" distB="0" distL="0" distR="0" wp14:anchorId="3B6423CB" wp14:editId="05A9BA33">
+                  <wp:extent cx="2880360" cy="2304562"/>
+                  <wp:effectExtent l="0" t="0" r="0" b="635"/>
+                  <wp:docPr id="1767596390" name="Picture 19"/>
+                  <wp:cNvGraphicFramePr>
+                    <a:graphicFrameLocks xmlns:a="http://schemas.openxmlformats.org/drawingml/2006/main" noChangeAspect="1"/>
+                  </wp:cNvGraphicFramePr>
+                  <a:graphic xmlns:a="http://schemas.openxmlformats.org/drawingml/2006/main">
+                    <a:graphicData uri="http://schemas.openxmlformats.org/drawingml/2006/picture">
+                      <pic:pic xmlns:pic="http://schemas.openxmlformats.org/drawingml/2006/picture">
+                        <pic:nvPicPr>
+                          <pic:cNvPr id="0" name="Picture 19"/>
+                          <pic:cNvPicPr>
+                            <a:picLocks noChangeAspect="1" noChangeArrowheads="1"/>
+                          </pic:cNvPicPr>
+                        </pic:nvPicPr>
+                        <pic:blipFill>
+                          <a:blip r:embed="rId10" cstate="print">
+                            <a:extLst>
+                              <a:ext uri="{28A0092B-C50C-407E-A947-70E740481C1C}">
+                                <a14:useLocalDpi xmlns:a14="http://schemas.microsoft.com/office/drawing/2010/main" val="0"/>
+                              </a:ext>
+                            </a:extLst>
+                          </a:blip>
+                          <a:srcRect/>
+                          <a:stretch>
+                            <a:fillRect/>
+                          </a:stretch>
+                        </pic:blipFill>
+                        <pic:spPr bwMode="auto">
+                          <a:xfrm>
+                            <a:off x="0" y="0"/>
+                            <a:ext cx="2880360" cy="2304562"/>
+                          </a:xfrm>
+                          <a:prstGeom prst="rect">
+                            <a:avLst/>
+                          </a:prstGeom>
+                          <a:noFill/>
+                          <a:ln>
+                            <a:noFill/>
+                          </a:ln>
+                        </pic:spPr>
+                      </pic:pic>
+                    </a:graphicData>
+                  </a:graphic>
+                </wp:inline>
+              </w:drawing>
+            </w:r>
+          </w:p>
+        </w:tc>
+      </w:tr>
+    </w:tbl>
     <w:p/>
+    <w:p>
+      <w:pPr>
+        <w:jc w:val="center"/>
+      </w:pPr>
+    </w:p>
+    <w:p>
+      <w:pPr>
+        <w:jc w:val="center"/>
+      </w:pPr>
+    </w:p>
     <w:p>
       <w:pPr>
         <w:pStyle w:val="Heading1"/>
@@ -1713,7 +2625,19 @@
         <w:rPr>
           <w:rFonts w:eastAsiaTheme="minorEastAsia"/>
         </w:rPr>
-        <w:t>This is a second order plant with relative degree 1.</w:t>
+        <w:t xml:space="preserve">This is a second order plant with relative </w:t>
+      </w:r>
+      <w:r>
+        <w:rPr>
+          <w:rFonts w:eastAsiaTheme="minorEastAsia"/>
+        </w:rPr>
+        <w:t>degree of</w:t>
+      </w:r>
+      <w:r>
+        <w:rPr>
+          <w:rFonts w:eastAsiaTheme="minorEastAsia"/>
+        </w:rPr>
+        <w:t xml:space="preserve"> 1.</w:t>
       </w:r>
       <w:r>
         <w:rPr>
@@ -1853,6 +2777,7 @@
         <w:rPr>
           <w:rFonts w:eastAsiaTheme="minorEastAsia"/>
         </w:rPr>
+        <w:lastRenderedPageBreak/>
         <w:t xml:space="preserve">The nominal value </w:t>
       </w:r>
       <m:oMath>
@@ -2511,6 +3436,124 @@
           </w:rPr>
           <m:t xml:space="preserve"> </m:t>
         </m:r>
+        <m:sSup>
+          <m:sSupPr>
+            <m:ctrlPr>
+              <w:rPr>
+                <w:rFonts w:ascii="Cambria Math" w:eastAsiaTheme="minorEastAsia" w:hAnsi="Cambria Math"/>
+                <w:i/>
+              </w:rPr>
+            </m:ctrlPr>
+          </m:sSupPr>
+          <m:e>
+            <m:r>
+              <w:rPr>
+                <w:rFonts w:ascii="Cambria Math" w:eastAsiaTheme="minorEastAsia" w:hAnsi="Cambria Math"/>
+              </w:rPr>
+              <m:t>c</m:t>
+            </m:r>
+          </m:e>
+          <m:sup>
+            <m:r>
+              <w:rPr>
+                <w:rFonts w:ascii="Cambria Math" w:eastAsiaTheme="minorEastAsia" w:hAnsi="Cambria Math"/>
+              </w:rPr>
+              <m:t>*</m:t>
+            </m:r>
+          </m:sup>
+        </m:sSup>
+      </m:oMath>
+      <w:r>
+        <w:rPr>
+          <w:rFonts w:eastAsiaTheme="minorEastAsia"/>
+        </w:rPr>
+        <w:t xml:space="preserve">. The nominal value </w:t>
+      </w:r>
+      <m:oMath>
+        <m:sSup>
+          <m:sSupPr>
+            <m:ctrlPr>
+              <w:rPr>
+                <w:rFonts w:ascii="Cambria Math" w:eastAsiaTheme="minorEastAsia" w:hAnsi="Cambria Math"/>
+                <w:i/>
+              </w:rPr>
+            </m:ctrlPr>
+          </m:sSupPr>
+          <m:e>
+            <m:r>
+              <w:rPr>
+                <w:rFonts w:ascii="Cambria Math" w:eastAsiaTheme="minorEastAsia" w:hAnsi="Cambria Math"/>
+              </w:rPr>
+              <m:t>d</m:t>
+            </m:r>
+          </m:e>
+          <m:sup>
+            <m:r>
+              <w:rPr>
+                <w:rFonts w:ascii="Cambria Math" w:eastAsiaTheme="minorEastAsia" w:hAnsi="Cambria Math"/>
+              </w:rPr>
+              <m:t>*</m:t>
+            </m:r>
+          </m:sup>
+        </m:sSup>
+        <m:d>
+          <m:dPr>
+            <m:ctrlPr>
+              <w:rPr>
+                <w:rFonts w:ascii="Cambria Math" w:eastAsiaTheme="minorEastAsia" w:hAnsi="Cambria Math"/>
+                <w:i/>
+              </w:rPr>
+            </m:ctrlPr>
+          </m:dPr>
+          <m:e>
+            <m:r>
+              <w:rPr>
+                <w:rFonts w:ascii="Cambria Math" w:eastAsiaTheme="minorEastAsia" w:hAnsi="Cambria Math"/>
+              </w:rPr>
+              <m:t>s</m:t>
+            </m:r>
+          </m:e>
+        </m:d>
+      </m:oMath>
+      <w:r>
+        <w:rPr>
+          <w:rFonts w:eastAsiaTheme="minorEastAsia"/>
+        </w:rPr>
+        <w:t xml:space="preserve"> will have a degree of 1. The solution for the nominal values </w:t>
+      </w:r>
+      <m:oMath>
+        <m:sSup>
+          <m:sSupPr>
+            <m:ctrlPr>
+              <w:rPr>
+                <w:rFonts w:ascii="Cambria Math" w:eastAsiaTheme="minorEastAsia" w:hAnsi="Cambria Math"/>
+                <w:i/>
+              </w:rPr>
+            </m:ctrlPr>
+          </m:sSupPr>
+          <m:e>
+            <m:r>
+              <w:rPr>
+                <w:rFonts w:ascii="Cambria Math" w:eastAsiaTheme="minorEastAsia" w:hAnsi="Cambria Math"/>
+              </w:rPr>
+              <m:t>c</m:t>
+            </m:r>
+          </m:e>
+          <m:sup>
+            <m:r>
+              <w:rPr>
+                <w:rFonts w:ascii="Cambria Math" w:eastAsiaTheme="minorEastAsia" w:hAnsi="Cambria Math"/>
+              </w:rPr>
+              <m:t>*</m:t>
+            </m:r>
+          </m:sup>
+        </m:sSup>
+        <m:r>
+          <w:rPr>
+            <w:rFonts w:ascii="Cambria Math" w:eastAsiaTheme="minorEastAsia" w:hAnsi="Cambria Math"/>
+          </w:rPr>
+          <m:t xml:space="preserve">, </m:t>
+        </m:r>
         <m:sSubSup>
           <m:sSubSupPr>
             <m:ctrlPr>
@@ -2524,6 +3567,1414 @@
             <m:r>
               <w:rPr>
                 <w:rFonts w:ascii="Cambria Math" w:eastAsiaTheme="minorEastAsia" w:hAnsi="Cambria Math"/>
+              </w:rPr>
+              <m:t>d</m:t>
+            </m:r>
+          </m:e>
+          <m:sub>
+            <m:r>
+              <w:rPr>
+                <w:rFonts w:ascii="Cambria Math" w:eastAsiaTheme="minorEastAsia" w:hAnsi="Cambria Math"/>
+              </w:rPr>
+              <m:t>0</m:t>
+            </m:r>
+          </m:sub>
+          <m:sup>
+            <m:r>
+              <w:rPr>
+                <w:rFonts w:ascii="Cambria Math" w:eastAsiaTheme="minorEastAsia" w:hAnsi="Cambria Math"/>
+              </w:rPr>
+              <m:t>*</m:t>
+            </m:r>
+          </m:sup>
+        </m:sSubSup>
+        <m:r>
+          <w:rPr>
+            <w:rFonts w:ascii="Cambria Math" w:eastAsiaTheme="minorEastAsia" w:hAnsi="Cambria Math"/>
+          </w:rPr>
+          <m:t>,</m:t>
+        </m:r>
+      </m:oMath>
+      <w:r>
+        <w:rPr>
+          <w:rFonts w:eastAsiaTheme="minorEastAsia"/>
+        </w:rPr>
+        <w:t xml:space="preserve"> and </w:t>
+      </w:r>
+      <m:oMath>
+        <m:sSup>
+          <m:sSupPr>
+            <m:ctrlPr>
+              <w:rPr>
+                <w:rFonts w:ascii="Cambria Math" w:eastAsiaTheme="minorEastAsia" w:hAnsi="Cambria Math"/>
+                <w:i/>
+              </w:rPr>
+            </m:ctrlPr>
+          </m:sSupPr>
+          <m:e>
+            <m:r>
+              <w:rPr>
+                <w:rFonts w:ascii="Cambria Math" w:eastAsiaTheme="minorEastAsia" w:hAnsi="Cambria Math"/>
+              </w:rPr>
+              <m:t>d</m:t>
+            </m:r>
+          </m:e>
+          <m:sup>
+            <m:r>
+              <w:rPr>
+                <w:rFonts w:ascii="Cambria Math" w:eastAsiaTheme="minorEastAsia" w:hAnsi="Cambria Math"/>
+              </w:rPr>
+              <m:t>*</m:t>
+            </m:r>
+          </m:sup>
+        </m:sSup>
+      </m:oMath>
+      <w:r>
+        <w:rPr>
+          <w:rFonts w:eastAsiaTheme="minorEastAsia"/>
+        </w:rPr>
+        <w:t xml:space="preserve"> are </w:t>
+      </w:r>
+    </w:p>
+    <w:p>
+      <w:pPr>
+        <w:jc w:val="both"/>
+        <w:rPr>
+          <w:rFonts w:eastAsiaTheme="minorEastAsia"/>
+        </w:rPr>
+      </w:pPr>
+      <m:oMathPara>
+        <m:oMath>
+          <m:r>
+            <w:rPr>
+              <w:rFonts w:ascii="Cambria Math" w:eastAsiaTheme="minorEastAsia" w:hAnsi="Cambria Math"/>
+            </w:rPr>
+            <m:t>λ</m:t>
+          </m:r>
+          <m:d>
+            <m:dPr>
+              <m:ctrlPr>
+                <w:rPr>
+                  <w:rFonts w:ascii="Cambria Math" w:eastAsiaTheme="minorEastAsia" w:hAnsi="Cambria Math"/>
+                  <w:i/>
+                </w:rPr>
+              </m:ctrlPr>
+            </m:dPr>
+            <m:e>
+              <m:r>
+                <w:rPr>
+                  <w:rFonts w:ascii="Cambria Math" w:eastAsiaTheme="minorEastAsia" w:hAnsi="Cambria Math"/>
+                </w:rPr>
+                <m:t>s</m:t>
+              </m:r>
+            </m:e>
+          </m:d>
+          <m:r>
+            <w:rPr>
+              <w:rFonts w:ascii="Cambria Math" w:eastAsiaTheme="minorEastAsia" w:hAnsi="Cambria Math"/>
+            </w:rPr>
+            <m:t>-</m:t>
+          </m:r>
+          <m:sSup>
+            <m:sSupPr>
+              <m:ctrlPr>
+                <w:rPr>
+                  <w:rFonts w:ascii="Cambria Math" w:eastAsiaTheme="minorEastAsia" w:hAnsi="Cambria Math"/>
+                  <w:i/>
+                </w:rPr>
+              </m:ctrlPr>
+            </m:sSupPr>
+            <m:e>
+              <m:r>
+                <w:rPr>
+                  <w:rFonts w:ascii="Cambria Math" w:eastAsiaTheme="minorEastAsia" w:hAnsi="Cambria Math"/>
+                </w:rPr>
+                <m:t>c</m:t>
+              </m:r>
+            </m:e>
+            <m:sup>
+              <m:r>
+                <w:rPr>
+                  <w:rFonts w:ascii="Cambria Math" w:eastAsiaTheme="minorEastAsia" w:hAnsi="Cambria Math"/>
+                </w:rPr>
+                <m:t>*</m:t>
+              </m:r>
+            </m:sup>
+          </m:sSup>
+          <m:d>
+            <m:dPr>
+              <m:ctrlPr>
+                <w:rPr>
+                  <w:rFonts w:ascii="Cambria Math" w:eastAsiaTheme="minorEastAsia" w:hAnsi="Cambria Math"/>
+                  <w:i/>
+                </w:rPr>
+              </m:ctrlPr>
+            </m:dPr>
+            <m:e>
+              <m:r>
+                <w:rPr>
+                  <w:rFonts w:ascii="Cambria Math" w:eastAsiaTheme="minorEastAsia" w:hAnsi="Cambria Math"/>
+                </w:rPr>
+                <m:t>s</m:t>
+              </m:r>
+            </m:e>
+          </m:d>
+          <m:r>
+            <w:rPr>
+              <w:rFonts w:ascii="Cambria Math" w:eastAsiaTheme="minorEastAsia" w:hAnsi="Cambria Math"/>
+            </w:rPr>
+            <m:t>=q</m:t>
+          </m:r>
+          <m:sSub>
+            <m:sSubPr>
+              <m:ctrlPr>
+                <w:rPr>
+                  <w:rFonts w:ascii="Cambria Math" w:eastAsiaTheme="minorEastAsia" w:hAnsi="Cambria Math"/>
+                  <w:i/>
+                </w:rPr>
+              </m:ctrlPr>
+            </m:sSubPr>
+            <m:e>
+              <m:r>
+                <w:rPr>
+                  <w:rFonts w:ascii="Cambria Math" w:eastAsiaTheme="minorEastAsia" w:hAnsi="Cambria Math"/>
+                </w:rPr>
+                <m:t>n</m:t>
+              </m:r>
+            </m:e>
+            <m:sub>
+              <m:r>
+                <w:rPr>
+                  <w:rFonts w:ascii="Cambria Math" w:eastAsiaTheme="minorEastAsia" w:hAnsi="Cambria Math"/>
+                </w:rPr>
+                <m:t>p</m:t>
+              </m:r>
+            </m:sub>
+          </m:sSub>
+          <m:d>
+            <m:dPr>
+              <m:ctrlPr>
+                <w:rPr>
+                  <w:rFonts w:ascii="Cambria Math" w:eastAsiaTheme="minorEastAsia" w:hAnsi="Cambria Math"/>
+                  <w:i/>
+                </w:rPr>
+              </m:ctrlPr>
+            </m:dPr>
+            <m:e>
+              <m:r>
+                <w:rPr>
+                  <w:rFonts w:ascii="Cambria Math" w:eastAsiaTheme="minorEastAsia" w:hAnsi="Cambria Math"/>
+                </w:rPr>
+                <m:t>s</m:t>
+              </m:r>
+            </m:e>
+          </m:d>
+          <m:r>
+            <w:rPr>
+              <w:rFonts w:ascii="Cambria Math" w:eastAsiaTheme="minorEastAsia" w:hAnsi="Cambria Math"/>
+            </w:rPr>
+            <m:t>→</m:t>
+          </m:r>
+          <m:sSup>
+            <m:sSupPr>
+              <m:ctrlPr>
+                <w:rPr>
+                  <w:rFonts w:ascii="Cambria Math" w:eastAsiaTheme="minorEastAsia" w:hAnsi="Cambria Math"/>
+                  <w:i/>
+                </w:rPr>
+              </m:ctrlPr>
+            </m:sSupPr>
+            <m:e>
+              <m:r>
+                <w:rPr>
+                  <w:rFonts w:ascii="Cambria Math" w:eastAsiaTheme="minorEastAsia" w:hAnsi="Cambria Math"/>
+                </w:rPr>
+                <m:t>c</m:t>
+              </m:r>
+            </m:e>
+            <m:sup>
+              <m:r>
+                <w:rPr>
+                  <w:rFonts w:ascii="Cambria Math" w:eastAsiaTheme="minorEastAsia" w:hAnsi="Cambria Math"/>
+                </w:rPr>
+                <m:t>*</m:t>
+              </m:r>
+            </m:sup>
+          </m:sSup>
+          <m:r>
+            <w:rPr>
+              <w:rFonts w:ascii="Cambria Math" w:eastAsiaTheme="minorEastAsia" w:hAnsi="Cambria Math"/>
+            </w:rPr>
+            <m:t>=</m:t>
+          </m:r>
+          <m:r>
+            <w:rPr>
+              <w:rFonts w:ascii="Cambria Math" w:eastAsiaTheme="minorEastAsia" w:hAnsi="Cambria Math"/>
+            </w:rPr>
+            <m:t>2</m:t>
+          </m:r>
+        </m:oMath>
+      </m:oMathPara>
+    </w:p>
+    <w:p>
+      <w:pPr>
+        <w:jc w:val="both"/>
+        <w:rPr>
+          <w:rFonts w:eastAsiaTheme="minorEastAsia"/>
+        </w:rPr>
+      </w:pPr>
+      <m:oMathPara>
+        <m:oMath>
+          <m:r>
+            <w:rPr>
+              <w:rFonts w:ascii="Cambria Math" w:eastAsiaTheme="minorEastAsia" w:hAnsi="Cambria Math"/>
+            </w:rPr>
+            <m:t>-</m:t>
+          </m:r>
+          <m:sSub>
+            <m:sSubPr>
+              <m:ctrlPr>
+                <w:rPr>
+                  <w:rFonts w:ascii="Cambria Math" w:eastAsiaTheme="minorEastAsia" w:hAnsi="Cambria Math"/>
+                  <w:i/>
+                </w:rPr>
+              </m:ctrlPr>
+            </m:sSubPr>
+            <m:e>
+              <m:r>
+                <w:rPr>
+                  <w:rFonts w:ascii="Cambria Math" w:eastAsiaTheme="minorEastAsia" w:hAnsi="Cambria Math"/>
+                </w:rPr>
+                <m:t>k</m:t>
+              </m:r>
+            </m:e>
+            <m:sub>
+              <m:r>
+                <w:rPr>
+                  <w:rFonts w:ascii="Cambria Math" w:eastAsiaTheme="minorEastAsia" w:hAnsi="Cambria Math"/>
+                </w:rPr>
+                <m:t>p</m:t>
+              </m:r>
+            </m:sub>
+          </m:sSub>
+          <m:sSup>
+            <m:sSupPr>
+              <m:ctrlPr>
+                <w:rPr>
+                  <w:rFonts w:ascii="Cambria Math" w:eastAsiaTheme="minorEastAsia" w:hAnsi="Cambria Math"/>
+                  <w:i/>
+                </w:rPr>
+              </m:ctrlPr>
+            </m:sSupPr>
+            <m:e>
+              <m:r>
+                <w:rPr>
+                  <w:rFonts w:ascii="Cambria Math" w:eastAsiaTheme="minorEastAsia" w:hAnsi="Cambria Math"/>
+                </w:rPr>
+                <m:t>d</m:t>
+              </m:r>
+            </m:e>
+            <m:sup>
+              <m:r>
+                <w:rPr>
+                  <w:rFonts w:ascii="Cambria Math" w:eastAsiaTheme="minorEastAsia" w:hAnsi="Cambria Math"/>
+                </w:rPr>
+                <m:t>*</m:t>
+              </m:r>
+            </m:sup>
+          </m:sSup>
+          <m:d>
+            <m:dPr>
+              <m:ctrlPr>
+                <w:rPr>
+                  <w:rFonts w:ascii="Cambria Math" w:eastAsiaTheme="minorEastAsia" w:hAnsi="Cambria Math"/>
+                  <w:i/>
+                </w:rPr>
+              </m:ctrlPr>
+            </m:dPr>
+            <m:e>
+              <m:r>
+                <w:rPr>
+                  <w:rFonts w:ascii="Cambria Math" w:eastAsiaTheme="minorEastAsia" w:hAnsi="Cambria Math"/>
+                </w:rPr>
+                <m:t>s</m:t>
+              </m:r>
+            </m:e>
+          </m:d>
+          <m:r>
+            <w:rPr>
+              <w:rFonts w:ascii="Cambria Math" w:eastAsiaTheme="minorEastAsia" w:hAnsi="Cambria Math"/>
+            </w:rPr>
+            <m:t>=</m:t>
+          </m:r>
+          <m:sSub>
+            <m:sSubPr>
+              <m:ctrlPr>
+                <w:rPr>
+                  <w:rFonts w:ascii="Cambria Math" w:eastAsiaTheme="minorEastAsia" w:hAnsi="Cambria Math"/>
+                  <w:i/>
+                </w:rPr>
+              </m:ctrlPr>
+            </m:sSubPr>
+            <m:e>
+              <m:r>
+                <w:rPr>
+                  <w:rFonts w:ascii="Cambria Math" w:eastAsiaTheme="minorEastAsia" w:hAnsi="Cambria Math"/>
+                </w:rPr>
+                <m:t>d</m:t>
+              </m:r>
+            </m:e>
+            <m:sub>
+              <m:r>
+                <w:rPr>
+                  <w:rFonts w:ascii="Cambria Math" w:eastAsiaTheme="minorEastAsia" w:hAnsi="Cambria Math"/>
+                </w:rPr>
+                <m:t>m</m:t>
+              </m:r>
+            </m:sub>
+          </m:sSub>
+          <m:d>
+            <m:dPr>
+              <m:ctrlPr>
+                <w:rPr>
+                  <w:rFonts w:ascii="Cambria Math" w:eastAsiaTheme="minorEastAsia" w:hAnsi="Cambria Math"/>
+                  <w:i/>
+                </w:rPr>
+              </m:ctrlPr>
+            </m:dPr>
+            <m:e>
+              <m:r>
+                <w:rPr>
+                  <w:rFonts w:ascii="Cambria Math" w:eastAsiaTheme="minorEastAsia" w:hAnsi="Cambria Math"/>
+                </w:rPr>
+                <m:t>s</m:t>
+              </m:r>
+            </m:e>
+          </m:d>
+          <m:r>
+            <w:rPr>
+              <w:rFonts w:ascii="Cambria Math" w:eastAsiaTheme="minorEastAsia" w:hAnsi="Cambria Math"/>
+            </w:rPr>
+            <m:t>-</m:t>
+          </m:r>
+          <m:r>
+            <w:rPr>
+              <w:rFonts w:ascii="Cambria Math" w:eastAsiaTheme="minorEastAsia" w:hAnsi="Cambria Math"/>
+            </w:rPr>
+            <m:t>q</m:t>
+          </m:r>
+          <m:sSub>
+            <m:sSubPr>
+              <m:ctrlPr>
+                <w:rPr>
+                  <w:rFonts w:ascii="Cambria Math" w:eastAsiaTheme="minorEastAsia" w:hAnsi="Cambria Math"/>
+                  <w:i/>
+                </w:rPr>
+              </m:ctrlPr>
+            </m:sSubPr>
+            <m:e>
+              <m:r>
+                <w:rPr>
+                  <w:rFonts w:ascii="Cambria Math" w:eastAsiaTheme="minorEastAsia" w:hAnsi="Cambria Math"/>
+                </w:rPr>
+                <m:t>d</m:t>
+              </m:r>
+            </m:e>
+            <m:sub>
+              <m:r>
+                <w:rPr>
+                  <w:rFonts w:ascii="Cambria Math" w:eastAsiaTheme="minorEastAsia" w:hAnsi="Cambria Math"/>
+                </w:rPr>
+                <m:t>p</m:t>
+              </m:r>
+            </m:sub>
+          </m:sSub>
+          <m:d>
+            <m:dPr>
+              <m:ctrlPr>
+                <w:rPr>
+                  <w:rFonts w:ascii="Cambria Math" w:eastAsiaTheme="minorEastAsia" w:hAnsi="Cambria Math"/>
+                  <w:i/>
+                </w:rPr>
+              </m:ctrlPr>
+            </m:dPr>
+            <m:e>
+              <m:r>
+                <w:rPr>
+                  <w:rFonts w:ascii="Cambria Math" w:eastAsiaTheme="minorEastAsia" w:hAnsi="Cambria Math"/>
+                </w:rPr>
+                <m:t>s</m:t>
+              </m:r>
+            </m:e>
+          </m:d>
+          <m:r>
+            <w:rPr>
+              <w:rFonts w:ascii="Cambria Math" w:eastAsiaTheme="minorEastAsia" w:hAnsi="Cambria Math"/>
+            </w:rPr>
+            <m:t xml:space="preserve">,  </m:t>
+          </m:r>
+          <m:f>
+            <m:fPr>
+              <m:ctrlPr>
+                <w:rPr>
+                  <w:rFonts w:ascii="Cambria Math" w:eastAsiaTheme="minorEastAsia" w:hAnsi="Cambria Math"/>
+                  <w:i/>
+                </w:rPr>
+              </m:ctrlPr>
+            </m:fPr>
+            <m:num>
+              <m:sSup>
+                <m:sSupPr>
+                  <m:ctrlPr>
+                    <w:rPr>
+                      <w:rFonts w:ascii="Cambria Math" w:eastAsiaTheme="minorEastAsia" w:hAnsi="Cambria Math"/>
+                      <w:i/>
+                    </w:rPr>
+                  </m:ctrlPr>
+                </m:sSupPr>
+                <m:e>
+                  <m:r>
+                    <w:rPr>
+                      <w:rFonts w:ascii="Cambria Math" w:eastAsiaTheme="minorEastAsia" w:hAnsi="Cambria Math"/>
+                    </w:rPr>
+                    <m:t>d</m:t>
+                  </m:r>
+                </m:e>
+                <m:sup>
+                  <m:r>
+                    <w:rPr>
+                      <w:rFonts w:ascii="Cambria Math" w:eastAsiaTheme="minorEastAsia" w:hAnsi="Cambria Math"/>
+                    </w:rPr>
+                    <m:t>*</m:t>
+                  </m:r>
+                </m:sup>
+              </m:sSup>
+              <m:d>
+                <m:dPr>
+                  <m:ctrlPr>
+                    <w:rPr>
+                      <w:rFonts w:ascii="Cambria Math" w:eastAsiaTheme="minorEastAsia" w:hAnsi="Cambria Math"/>
+                      <w:i/>
+                    </w:rPr>
+                  </m:ctrlPr>
+                </m:dPr>
+                <m:e>
+                  <m:r>
+                    <w:rPr>
+                      <w:rFonts w:ascii="Cambria Math" w:eastAsiaTheme="minorEastAsia" w:hAnsi="Cambria Math"/>
+                    </w:rPr>
+                    <m:t>s</m:t>
+                  </m:r>
+                </m:e>
+              </m:d>
+            </m:num>
+            <m:den>
+              <m:r>
+                <w:rPr>
+                  <w:rFonts w:ascii="Cambria Math" w:eastAsiaTheme="minorEastAsia" w:hAnsi="Cambria Math"/>
+                </w:rPr>
+                <m:t>λ</m:t>
+              </m:r>
+              <m:d>
+                <m:dPr>
+                  <m:ctrlPr>
+                    <w:rPr>
+                      <w:rFonts w:ascii="Cambria Math" w:eastAsiaTheme="minorEastAsia" w:hAnsi="Cambria Math"/>
+                      <w:i/>
+                    </w:rPr>
+                  </m:ctrlPr>
+                </m:dPr>
+                <m:e>
+                  <m:r>
+                    <w:rPr>
+                      <w:rFonts w:ascii="Cambria Math" w:eastAsiaTheme="minorEastAsia" w:hAnsi="Cambria Math"/>
+                    </w:rPr>
+                    <m:t>s</m:t>
+                  </m:r>
+                </m:e>
+              </m:d>
+            </m:den>
+          </m:f>
+          <m:r>
+            <w:rPr>
+              <w:rFonts w:ascii="Cambria Math" w:eastAsiaTheme="minorEastAsia" w:hAnsi="Cambria Math"/>
+            </w:rPr>
+            <m:t>=</m:t>
+          </m:r>
+          <m:sSubSup>
+            <m:sSubSupPr>
+              <m:ctrlPr>
+                <w:rPr>
+                  <w:rFonts w:ascii="Cambria Math" w:eastAsiaTheme="minorEastAsia" w:hAnsi="Cambria Math"/>
+                  <w:i/>
+                </w:rPr>
+              </m:ctrlPr>
+            </m:sSubSupPr>
+            <m:e>
+              <m:r>
+                <w:rPr>
+                  <w:rFonts w:ascii="Cambria Math" w:eastAsiaTheme="minorEastAsia" w:hAnsi="Cambria Math"/>
+                </w:rPr>
+                <m:t>d</m:t>
+              </m:r>
+            </m:e>
+            <m:sub>
+              <m:r>
+                <w:rPr>
+                  <w:rFonts w:ascii="Cambria Math" w:eastAsiaTheme="minorEastAsia" w:hAnsi="Cambria Math"/>
+                </w:rPr>
+                <m:t>0</m:t>
+              </m:r>
+            </m:sub>
+            <m:sup>
+              <m:r>
+                <w:rPr>
+                  <w:rFonts w:ascii="Cambria Math" w:eastAsiaTheme="minorEastAsia" w:hAnsi="Cambria Math"/>
+                </w:rPr>
+                <m:t>*</m:t>
+              </m:r>
+            </m:sup>
+          </m:sSubSup>
+          <m:r>
+            <w:rPr>
+              <w:rFonts w:ascii="Cambria Math" w:eastAsiaTheme="minorEastAsia" w:hAnsi="Cambria Math"/>
+            </w:rPr>
+            <m:t>+</m:t>
+          </m:r>
+          <m:f>
+            <m:fPr>
+              <m:ctrlPr>
+                <w:rPr>
+                  <w:rFonts w:ascii="Cambria Math" w:eastAsiaTheme="minorEastAsia" w:hAnsi="Cambria Math"/>
+                  <w:i/>
+                </w:rPr>
+              </m:ctrlPr>
+            </m:fPr>
+            <m:num>
+              <m:sSup>
+                <m:sSupPr>
+                  <m:ctrlPr>
+                    <w:rPr>
+                      <w:rFonts w:ascii="Cambria Math" w:eastAsiaTheme="minorEastAsia" w:hAnsi="Cambria Math"/>
+                      <w:i/>
+                    </w:rPr>
+                  </m:ctrlPr>
+                </m:sSupPr>
+                <m:e>
+                  <m:r>
+                    <w:rPr>
+                      <w:rFonts w:ascii="Cambria Math" w:eastAsiaTheme="minorEastAsia" w:hAnsi="Cambria Math"/>
+                    </w:rPr>
+                    <m:t>d</m:t>
+                  </m:r>
+                </m:e>
+                <m:sup>
+                  <m:r>
+                    <w:rPr>
+                      <w:rFonts w:ascii="Cambria Math" w:eastAsiaTheme="minorEastAsia" w:hAnsi="Cambria Math"/>
+                    </w:rPr>
+                    <m:t>*</m:t>
+                  </m:r>
+                </m:sup>
+              </m:sSup>
+            </m:num>
+            <m:den>
+              <m:r>
+                <w:rPr>
+                  <w:rFonts w:ascii="Cambria Math" w:eastAsiaTheme="minorEastAsia" w:hAnsi="Cambria Math"/>
+                </w:rPr>
+                <m:t>λ</m:t>
+              </m:r>
+              <m:d>
+                <m:dPr>
+                  <m:ctrlPr>
+                    <w:rPr>
+                      <w:rFonts w:ascii="Cambria Math" w:eastAsiaTheme="minorEastAsia" w:hAnsi="Cambria Math"/>
+                      <w:i/>
+                    </w:rPr>
+                  </m:ctrlPr>
+                </m:dPr>
+                <m:e>
+                  <m:r>
+                    <w:rPr>
+                      <w:rFonts w:ascii="Cambria Math" w:eastAsiaTheme="minorEastAsia" w:hAnsi="Cambria Math"/>
+                    </w:rPr>
+                    <m:t>s</m:t>
+                  </m:r>
+                </m:e>
+              </m:d>
+            </m:den>
+          </m:f>
+        </m:oMath>
+      </m:oMathPara>
+    </w:p>
+    <w:p>
+      <w:pPr>
+        <w:jc w:val="both"/>
+        <w:rPr>
+          <w:rFonts w:eastAsiaTheme="minorEastAsia"/>
+        </w:rPr>
+      </w:pPr>
+      <m:oMathPara>
+        <m:oMath>
+          <m:r>
+            <w:rPr>
+              <w:rFonts w:ascii="Cambria Math" w:eastAsiaTheme="minorEastAsia" w:hAnsi="Cambria Math"/>
+            </w:rPr>
+            <m:t>⇒</m:t>
+          </m:r>
+          <m:sSup>
+            <m:sSupPr>
+              <m:ctrlPr>
+                <w:rPr>
+                  <w:rFonts w:ascii="Cambria Math" w:eastAsiaTheme="minorEastAsia" w:hAnsi="Cambria Math"/>
+                  <w:i/>
+                </w:rPr>
+              </m:ctrlPr>
+            </m:sSupPr>
+            <m:e>
+              <m:r>
+                <w:rPr>
+                  <w:rFonts w:ascii="Cambria Math" w:eastAsiaTheme="minorEastAsia" w:hAnsi="Cambria Math"/>
+                </w:rPr>
+                <m:t>d</m:t>
+              </m:r>
+            </m:e>
+            <m:sup>
+              <m:r>
+                <w:rPr>
+                  <w:rFonts w:ascii="Cambria Math" w:eastAsiaTheme="minorEastAsia" w:hAnsi="Cambria Math"/>
+                </w:rPr>
+                <m:t>*</m:t>
+              </m:r>
+            </m:sup>
+          </m:sSup>
+          <m:d>
+            <m:dPr>
+              <m:ctrlPr>
+                <w:rPr>
+                  <w:rFonts w:ascii="Cambria Math" w:eastAsiaTheme="minorEastAsia" w:hAnsi="Cambria Math"/>
+                  <w:i/>
+                </w:rPr>
+              </m:ctrlPr>
+            </m:dPr>
+            <m:e>
+              <m:r>
+                <w:rPr>
+                  <w:rFonts w:ascii="Cambria Math" w:eastAsiaTheme="minorEastAsia" w:hAnsi="Cambria Math"/>
+                </w:rPr>
+                <m:t>s</m:t>
+              </m:r>
+            </m:e>
+          </m:d>
+          <m:r>
+            <w:rPr>
+              <w:rFonts w:ascii="Cambria Math" w:eastAsiaTheme="minorEastAsia" w:hAnsi="Cambria Math"/>
+            </w:rPr>
+            <m:t xml:space="preserve">= -6s-4,  </m:t>
+          </m:r>
+          <m:f>
+            <m:fPr>
+              <m:ctrlPr>
+                <w:rPr>
+                  <w:rFonts w:ascii="Cambria Math" w:eastAsiaTheme="minorEastAsia" w:hAnsi="Cambria Math"/>
+                  <w:i/>
+                </w:rPr>
+              </m:ctrlPr>
+            </m:fPr>
+            <m:num>
+              <m:sSup>
+                <m:sSupPr>
+                  <m:ctrlPr>
+                    <w:rPr>
+                      <w:rFonts w:ascii="Cambria Math" w:eastAsiaTheme="minorEastAsia" w:hAnsi="Cambria Math"/>
+                      <w:i/>
+                    </w:rPr>
+                  </m:ctrlPr>
+                </m:sSupPr>
+                <m:e>
+                  <m:r>
+                    <w:rPr>
+                      <w:rFonts w:ascii="Cambria Math" w:eastAsiaTheme="minorEastAsia" w:hAnsi="Cambria Math"/>
+                    </w:rPr>
+                    <m:t>d</m:t>
+                  </m:r>
+                </m:e>
+                <m:sup>
+                  <m:r>
+                    <w:rPr>
+                      <w:rFonts w:ascii="Cambria Math" w:eastAsiaTheme="minorEastAsia" w:hAnsi="Cambria Math"/>
+                    </w:rPr>
+                    <m:t>*</m:t>
+                  </m:r>
+                </m:sup>
+              </m:sSup>
+              <m:d>
+                <m:dPr>
+                  <m:ctrlPr>
+                    <w:rPr>
+                      <w:rFonts w:ascii="Cambria Math" w:eastAsiaTheme="minorEastAsia" w:hAnsi="Cambria Math"/>
+                      <w:i/>
+                    </w:rPr>
+                  </m:ctrlPr>
+                </m:dPr>
+                <m:e>
+                  <m:r>
+                    <w:rPr>
+                      <w:rFonts w:ascii="Cambria Math" w:eastAsiaTheme="minorEastAsia" w:hAnsi="Cambria Math"/>
+                    </w:rPr>
+                    <m:t>s</m:t>
+                  </m:r>
+                </m:e>
+              </m:d>
+            </m:num>
+            <m:den>
+              <m:r>
+                <w:rPr>
+                  <w:rFonts w:ascii="Cambria Math" w:eastAsiaTheme="minorEastAsia" w:hAnsi="Cambria Math"/>
+                </w:rPr>
+                <m:t>λ</m:t>
+              </m:r>
+              <m:d>
+                <m:dPr>
+                  <m:ctrlPr>
+                    <w:rPr>
+                      <w:rFonts w:ascii="Cambria Math" w:eastAsiaTheme="minorEastAsia" w:hAnsi="Cambria Math"/>
+                      <w:i/>
+                    </w:rPr>
+                  </m:ctrlPr>
+                </m:dPr>
+                <m:e>
+                  <m:r>
+                    <w:rPr>
+                      <w:rFonts w:ascii="Cambria Math" w:eastAsiaTheme="minorEastAsia" w:hAnsi="Cambria Math"/>
+                    </w:rPr>
+                    <m:t>s</m:t>
+                  </m:r>
+                </m:e>
+              </m:d>
+            </m:den>
+          </m:f>
+          <m:r>
+            <w:rPr>
+              <w:rFonts w:ascii="Cambria Math" w:eastAsiaTheme="minorEastAsia" w:hAnsi="Cambria Math"/>
+            </w:rPr>
+            <m:t>=</m:t>
+          </m:r>
+          <m:r>
+            <w:rPr>
+              <w:rFonts w:ascii="Cambria Math" w:eastAsiaTheme="minorEastAsia" w:hAnsi="Cambria Math"/>
+            </w:rPr>
+            <m:t>-6</m:t>
+          </m:r>
+          <m:r>
+            <w:rPr>
+              <w:rFonts w:ascii="Cambria Math" w:eastAsiaTheme="minorEastAsia" w:hAnsi="Cambria Math"/>
+            </w:rPr>
+            <m:t>+</m:t>
+          </m:r>
+          <m:f>
+            <m:fPr>
+              <m:ctrlPr>
+                <w:rPr>
+                  <w:rFonts w:ascii="Cambria Math" w:eastAsiaTheme="minorEastAsia" w:hAnsi="Cambria Math"/>
+                  <w:i/>
+                </w:rPr>
+              </m:ctrlPr>
+            </m:fPr>
+            <m:num>
+              <m:r>
+                <w:rPr>
+                  <w:rFonts w:ascii="Cambria Math" w:eastAsiaTheme="minorEastAsia" w:hAnsi="Cambria Math"/>
+                </w:rPr>
+                <m:t>14</m:t>
+              </m:r>
+            </m:num>
+            <m:den>
+              <m:r>
+                <w:rPr>
+                  <w:rFonts w:ascii="Cambria Math" w:eastAsiaTheme="minorEastAsia" w:hAnsi="Cambria Math"/>
+                </w:rPr>
+                <m:t>λ</m:t>
+              </m:r>
+              <m:d>
+                <m:dPr>
+                  <m:ctrlPr>
+                    <w:rPr>
+                      <w:rFonts w:ascii="Cambria Math" w:eastAsiaTheme="minorEastAsia" w:hAnsi="Cambria Math"/>
+                      <w:i/>
+                    </w:rPr>
+                  </m:ctrlPr>
+                </m:dPr>
+                <m:e>
+                  <m:r>
+                    <w:rPr>
+                      <w:rFonts w:ascii="Cambria Math" w:eastAsiaTheme="minorEastAsia" w:hAnsi="Cambria Math"/>
+                    </w:rPr>
+                    <m:t>s</m:t>
+                  </m:r>
+                </m:e>
+              </m:d>
+            </m:den>
+          </m:f>
+          <m:r>
+            <w:rPr>
+              <w:rFonts w:ascii="Cambria Math" w:eastAsiaTheme="minorEastAsia" w:hAnsi="Cambria Math"/>
+            </w:rPr>
+            <m:t xml:space="preserve"> </m:t>
+          </m:r>
+        </m:oMath>
+      </m:oMathPara>
+    </w:p>
+    <w:p>
+      <w:pPr>
+        <w:jc w:val="both"/>
+        <w:rPr>
+          <w:rFonts w:eastAsiaTheme="minorEastAsia"/>
+        </w:rPr>
+      </w:pPr>
+      <m:oMathPara>
+        <m:oMath>
+          <m:sSup>
+            <m:sSupPr>
+              <m:ctrlPr>
+                <w:rPr>
+                  <w:rFonts w:ascii="Cambria Math" w:eastAsiaTheme="minorEastAsia" w:hAnsi="Cambria Math"/>
+                  <w:i/>
+                </w:rPr>
+              </m:ctrlPr>
+            </m:sSupPr>
+            <m:e>
+              <m:r>
+                <w:rPr>
+                  <w:rFonts w:ascii="Cambria Math" w:eastAsiaTheme="minorEastAsia" w:hAnsi="Cambria Math"/>
+                </w:rPr>
+                <m:t>c</m:t>
+              </m:r>
+            </m:e>
+            <m:sup>
+              <m:r>
+                <w:rPr>
+                  <w:rFonts w:ascii="Cambria Math" w:eastAsiaTheme="minorEastAsia" w:hAnsi="Cambria Math"/>
+                </w:rPr>
+                <m:t>*</m:t>
+              </m:r>
+            </m:sup>
+          </m:sSup>
+          <m:r>
+            <w:rPr>
+              <w:rFonts w:ascii="Cambria Math" w:eastAsiaTheme="minorEastAsia" w:hAnsi="Cambria Math"/>
+            </w:rPr>
+            <m:t>=2</m:t>
+          </m:r>
+          <m:r>
+            <w:rPr>
+              <w:rFonts w:ascii="Cambria Math" w:eastAsiaTheme="minorEastAsia" w:hAnsi="Cambria Math"/>
+            </w:rPr>
+            <m:t xml:space="preserve">,  </m:t>
+          </m:r>
+          <m:sSubSup>
+            <m:sSubSupPr>
+              <m:ctrlPr>
+                <w:rPr>
+                  <w:rFonts w:ascii="Cambria Math" w:eastAsiaTheme="minorEastAsia" w:hAnsi="Cambria Math"/>
+                  <w:i/>
+                </w:rPr>
+              </m:ctrlPr>
+            </m:sSubSupPr>
+            <m:e>
+              <m:r>
+                <w:rPr>
+                  <w:rFonts w:ascii="Cambria Math" w:eastAsiaTheme="minorEastAsia" w:hAnsi="Cambria Math"/>
+                </w:rPr>
+                <m:t>d</m:t>
+              </m:r>
+            </m:e>
+            <m:sub>
+              <m:r>
+                <w:rPr>
+                  <w:rFonts w:ascii="Cambria Math" w:eastAsiaTheme="minorEastAsia" w:hAnsi="Cambria Math"/>
+                </w:rPr>
+                <m:t>0</m:t>
+              </m:r>
+            </m:sub>
+            <m:sup>
+              <m:r>
+                <w:rPr>
+                  <w:rFonts w:ascii="Cambria Math" w:eastAsiaTheme="minorEastAsia" w:hAnsi="Cambria Math"/>
+                </w:rPr>
+                <m:t>*</m:t>
+              </m:r>
+            </m:sup>
+          </m:sSubSup>
+          <m:r>
+            <w:rPr>
+              <w:rFonts w:ascii="Cambria Math" w:eastAsiaTheme="minorEastAsia" w:hAnsi="Cambria Math"/>
+            </w:rPr>
+            <m:t xml:space="preserve">=-6,  </m:t>
+          </m:r>
+          <m:sSup>
+            <m:sSupPr>
+              <m:ctrlPr>
+                <w:rPr>
+                  <w:rFonts w:ascii="Cambria Math" w:eastAsiaTheme="minorEastAsia" w:hAnsi="Cambria Math"/>
+                  <w:i/>
+                </w:rPr>
+              </m:ctrlPr>
+            </m:sSupPr>
+            <m:e>
+              <m:r>
+                <w:rPr>
+                  <w:rFonts w:ascii="Cambria Math" w:eastAsiaTheme="minorEastAsia" w:hAnsi="Cambria Math"/>
+                </w:rPr>
+                <m:t>d</m:t>
+              </m:r>
+            </m:e>
+            <m:sup>
+              <m:r>
+                <w:rPr>
+                  <w:rFonts w:ascii="Cambria Math" w:eastAsiaTheme="minorEastAsia" w:hAnsi="Cambria Math"/>
+                </w:rPr>
+                <m:t>*</m:t>
+              </m:r>
+            </m:sup>
+          </m:sSup>
+          <m:r>
+            <w:rPr>
+              <w:rFonts w:ascii="Cambria Math" w:eastAsiaTheme="minorEastAsia" w:hAnsi="Cambria Math"/>
+            </w:rPr>
+            <m:t>=14</m:t>
+          </m:r>
+        </m:oMath>
+      </m:oMathPara>
+    </w:p>
+    <w:p>
+      <w:pPr>
+        <w:jc w:val="both"/>
+        <w:rPr>
+          <w:rFonts w:eastAsiaTheme="minorEastAsia"/>
+        </w:rPr>
+      </w:pPr>
+      <w:r>
+        <w:rPr>
+          <w:rFonts w:eastAsiaTheme="minorEastAsia"/>
+        </w:rPr>
+        <w:t>The nominal values are then</w:t>
+      </w:r>
+    </w:p>
+    <w:p>
+      <w:pPr>
+        <w:jc w:val="both"/>
+        <w:rPr>
+          <w:rFonts w:eastAsiaTheme="minorEastAsia"/>
+        </w:rPr>
+      </w:pPr>
+      <m:oMathPara>
+        <m:oMath>
+          <m:sSubSup>
+            <m:sSubSupPr>
+              <m:ctrlPr>
+                <w:rPr>
+                  <w:rFonts w:ascii="Cambria Math" w:eastAsiaTheme="minorEastAsia" w:hAnsi="Cambria Math"/>
+                  <w:i/>
+                </w:rPr>
+              </m:ctrlPr>
+            </m:sSubSupPr>
+            <m:e>
+              <m:r>
+                <w:rPr>
+                  <w:rFonts w:ascii="Cambria Math" w:eastAsiaTheme="minorEastAsia" w:hAnsi="Cambria Math"/>
+                </w:rPr>
+                <m:t>c</m:t>
+              </m:r>
+            </m:e>
+            <m:sub>
+              <m:r>
+                <w:rPr>
+                  <w:rFonts w:ascii="Cambria Math" w:eastAsiaTheme="minorEastAsia" w:hAnsi="Cambria Math"/>
+                </w:rPr>
+                <m:t>0</m:t>
+              </m:r>
+            </m:sub>
+            <m:sup>
+              <m:r>
+                <w:rPr>
+                  <w:rFonts w:ascii="Cambria Math" w:eastAsiaTheme="minorEastAsia" w:hAnsi="Cambria Math"/>
+                </w:rPr>
+                <m:t>*</m:t>
+              </m:r>
+            </m:sup>
+          </m:sSubSup>
+          <m:r>
+            <w:rPr>
+              <w:rFonts w:ascii="Cambria Math" w:eastAsiaTheme="minorEastAsia" w:hAnsi="Cambria Math"/>
+            </w:rPr>
+            <m:t xml:space="preserve">=1,  </m:t>
+          </m:r>
+          <m:sSup>
+            <m:sSupPr>
+              <m:ctrlPr>
+                <w:rPr>
+                  <w:rFonts w:ascii="Cambria Math" w:eastAsiaTheme="minorEastAsia" w:hAnsi="Cambria Math"/>
+                  <w:i/>
+                </w:rPr>
+              </m:ctrlPr>
+            </m:sSupPr>
+            <m:e>
+              <m:r>
+                <w:rPr>
+                  <w:rFonts w:ascii="Cambria Math" w:eastAsiaTheme="minorEastAsia" w:hAnsi="Cambria Math"/>
+                </w:rPr>
+                <m:t>c</m:t>
+              </m:r>
+            </m:e>
+            <m:sup>
+              <m:r>
+                <w:rPr>
+                  <w:rFonts w:ascii="Cambria Math" w:eastAsiaTheme="minorEastAsia" w:hAnsi="Cambria Math"/>
+                </w:rPr>
+                <m:t>*</m:t>
+              </m:r>
+            </m:sup>
+          </m:sSup>
+          <m:r>
+            <w:rPr>
+              <w:rFonts w:ascii="Cambria Math" w:eastAsiaTheme="minorEastAsia" w:hAnsi="Cambria Math"/>
+            </w:rPr>
+            <m:t xml:space="preserve">=2,  </m:t>
+          </m:r>
+          <m:sSubSup>
+            <m:sSubSupPr>
+              <m:ctrlPr>
+                <w:rPr>
+                  <w:rFonts w:ascii="Cambria Math" w:eastAsiaTheme="minorEastAsia" w:hAnsi="Cambria Math"/>
+                  <w:i/>
+                </w:rPr>
+              </m:ctrlPr>
+            </m:sSubSupPr>
+            <m:e>
+              <m:r>
+                <w:rPr>
+                  <w:rFonts w:ascii="Cambria Math" w:eastAsiaTheme="minorEastAsia" w:hAnsi="Cambria Math"/>
+                </w:rPr>
+                <m:t>d</m:t>
+              </m:r>
+            </m:e>
+            <m:sub>
+              <m:r>
+                <w:rPr>
+                  <w:rFonts w:ascii="Cambria Math" w:eastAsiaTheme="minorEastAsia" w:hAnsi="Cambria Math"/>
+                </w:rPr>
+                <m:t>0</m:t>
+              </m:r>
+            </m:sub>
+            <m:sup>
+              <m:r>
+                <w:rPr>
+                  <w:rFonts w:ascii="Cambria Math" w:eastAsiaTheme="minorEastAsia" w:hAnsi="Cambria Math"/>
+                </w:rPr>
+                <m:t>*</m:t>
+              </m:r>
+            </m:sup>
+          </m:sSubSup>
+          <m:r>
+            <w:rPr>
+              <w:rFonts w:ascii="Cambria Math" w:eastAsiaTheme="minorEastAsia" w:hAnsi="Cambria Math"/>
+            </w:rPr>
+            <m:t xml:space="preserve">= </m:t>
+          </m:r>
+          <m:r>
+            <w:rPr>
+              <w:rFonts w:ascii="Cambria Math" w:eastAsiaTheme="minorEastAsia" w:hAnsi="Cambria Math"/>
+            </w:rPr>
+            <m:t>-6</m:t>
+          </m:r>
+          <m:r>
+            <w:rPr>
+              <w:rFonts w:ascii="Cambria Math" w:eastAsiaTheme="minorEastAsia" w:hAnsi="Cambria Math"/>
+            </w:rPr>
+            <m:t xml:space="preserve">,  </m:t>
+          </m:r>
+          <m:sSup>
+            <m:sSupPr>
+              <m:ctrlPr>
+                <w:rPr>
+                  <w:rFonts w:ascii="Cambria Math" w:eastAsiaTheme="minorEastAsia" w:hAnsi="Cambria Math"/>
+                  <w:i/>
+                </w:rPr>
+              </m:ctrlPr>
+            </m:sSupPr>
+            <m:e>
+              <m:r>
+                <w:rPr>
+                  <w:rFonts w:ascii="Cambria Math" w:eastAsiaTheme="minorEastAsia" w:hAnsi="Cambria Math"/>
+                </w:rPr>
+                <m:t>d</m:t>
+              </m:r>
+            </m:e>
+            <m:sup>
+              <m:r>
+                <w:rPr>
+                  <w:rFonts w:ascii="Cambria Math" w:eastAsiaTheme="minorEastAsia" w:hAnsi="Cambria Math"/>
+                </w:rPr>
+                <m:t>*</m:t>
+              </m:r>
+            </m:sup>
+          </m:sSup>
+          <m:r>
+            <w:rPr>
+              <w:rFonts w:ascii="Cambria Math" w:eastAsiaTheme="minorEastAsia" w:hAnsi="Cambria Math"/>
+            </w:rPr>
+            <m:t xml:space="preserve">= </m:t>
+          </m:r>
+          <m:r>
+            <w:rPr>
+              <w:rFonts w:ascii="Cambria Math" w:eastAsiaTheme="minorEastAsia" w:hAnsi="Cambria Math"/>
+            </w:rPr>
+            <m:t>14</m:t>
+          </m:r>
+        </m:oMath>
+      </m:oMathPara>
+    </w:p>
+    <w:p>
+      <w:pPr>
+        <w:jc w:val="both"/>
+        <w:rPr>
+          <w:rFonts w:eastAsiaTheme="minorEastAsia"/>
+        </w:rPr>
+      </w:pPr>
+      <w:r>
+        <w:rPr>
+          <w:rFonts w:eastAsiaTheme="minorEastAsia"/>
+        </w:rPr>
+        <w:t xml:space="preserve">The evolution of the output error and adaptation parameters are shown below. </w:t>
+      </w:r>
+    </w:p>
+    <w:p>
+      <w:pPr>
+        <w:jc w:val="both"/>
+        <w:rPr>
+          <w:rFonts w:eastAsiaTheme="minorEastAsia"/>
+        </w:rPr>
+      </w:pPr>
+      <w:r>
+        <w:rPr>
+          <w:rFonts w:eastAsiaTheme="minorEastAsia"/>
+        </w:rPr>
+        <w:t>Ultimately, the direct MRAC algorithm is able to control the plant such that the output error between the plant and model reference tends to zero.</w:t>
+      </w:r>
+      <w:r>
+        <w:rPr>
+          <w:rFonts w:eastAsiaTheme="minorEastAsia"/>
+        </w:rPr>
+        <w:t xml:space="preserve"> This is guaranteed from the direct MRAC algorithm </w:t>
+      </w:r>
+      <w:r>
+        <w:rPr>
+          <w:rFonts w:eastAsiaTheme="minorEastAsia"/>
+          <w:b/>
+          <w:bCs/>
+        </w:rPr>
+        <w:t>WHY?</w:t>
+      </w:r>
+      <w:r>
+        <w:rPr>
+          <w:rFonts w:eastAsiaTheme="minorEastAsia"/>
+        </w:rPr>
+        <w:t xml:space="preserve">. </w:t>
+      </w:r>
+    </w:p>
+    <w:p>
+      <w:pPr>
+        <w:jc w:val="both"/>
+        <w:rPr>
+          <w:rFonts w:eastAsiaTheme="minorEastAsia"/>
+        </w:rPr>
+      </w:pPr>
+      <w:r>
+        <w:rPr>
+          <w:rFonts w:eastAsiaTheme="minorEastAsia"/>
+        </w:rPr>
+        <w:t xml:space="preserve"> </w:t>
+      </w:r>
+      <w:r>
+        <w:rPr>
+          <w:rFonts w:eastAsiaTheme="minorEastAsia"/>
+        </w:rPr>
+        <w:t>The</w:t>
+      </w:r>
+      <w:r>
+        <w:rPr>
+          <w:rFonts w:eastAsiaTheme="minorEastAsia"/>
+        </w:rPr>
+        <w:t xml:space="preserve"> parameters themselves are not approaching the nominal value.</w:t>
+      </w:r>
+      <w:r>
+        <w:rPr>
+          <w:rFonts w:eastAsiaTheme="minorEastAsia"/>
+        </w:rPr>
+        <w:t xml:space="preserve"> This seems to </w:t>
+      </w:r>
+      <w:r>
+        <w:rPr>
+          <w:rFonts w:eastAsiaTheme="minorEastAsia"/>
+        </w:rPr>
+        <w:t>be</w:t>
+      </w:r>
+      <w:r>
+        <w:rPr>
+          <w:rFonts w:eastAsiaTheme="minorEastAsia"/>
+        </w:rPr>
+        <w:t xml:space="preserve"> a matter of excitation. The current reference signal is a single sinusoidal wave. This is not enough information for the parameter solution driving the error decay to be unique. If the reference signal included two waves with different frequencies, there may be </w:t>
+      </w:r>
+      <w:r>
+        <w:rPr>
+          <w:rFonts w:eastAsiaTheme="minorEastAsia"/>
+        </w:rPr>
+        <w:t>convergence to</w:t>
+      </w:r>
+      <w:r>
+        <w:rPr>
+          <w:rFonts w:eastAsiaTheme="minorEastAsia"/>
+        </w:rPr>
+        <w:t xml:space="preserve"> the nominal values as well. </w:t>
+      </w:r>
+      <w:r>
+        <w:rPr>
+          <w:rFonts w:eastAsiaTheme="minorEastAsia"/>
+        </w:rPr>
+        <w:t xml:space="preserve"> </w:t>
+      </w:r>
+    </w:p>
+    <w:p>
+      <w:pPr>
+        <w:pStyle w:val="Heading2"/>
+      </w:pPr>
+      <w:r>
+        <w:t>Part (b)</w:t>
+      </w:r>
+    </w:p>
+    <w:p>
+      <m:oMathPara>
+        <m:oMath>
+          <m:r>
+            <w:rPr>
+              <w:rFonts w:ascii="Cambria Math" w:hAnsi="Cambria Math"/>
+            </w:rPr>
+            <m:t>P</m:t>
+          </m:r>
+          <m:d>
+            <m:dPr>
+              <m:ctrlPr>
+                <w:rPr>
+                  <w:rFonts w:ascii="Cambria Math" w:hAnsi="Cambria Math"/>
+                  <w:i/>
+                </w:rPr>
+              </m:ctrlPr>
+            </m:dPr>
+            <m:e>
+              <m:r>
+                <w:rPr>
+                  <w:rFonts w:ascii="Cambria Math" w:hAnsi="Cambria Math"/>
+                </w:rPr>
+                <m:t>s</m:t>
+              </m:r>
+            </m:e>
+          </m:d>
+          <m:r>
+            <w:rPr>
+              <w:rFonts w:ascii="Cambria Math" w:hAnsi="Cambria Math"/>
+            </w:rPr>
+            <m:t>=</m:t>
+          </m:r>
+          <m:f>
+            <m:fPr>
+              <m:ctrlPr>
+                <w:rPr>
+                  <w:rFonts w:ascii="Cambria Math" w:hAnsi="Cambria Math"/>
+                  <w:i/>
+                </w:rPr>
+              </m:ctrlPr>
+            </m:fPr>
+            <m:num>
+              <m:r>
+                <w:rPr>
+                  <w:rFonts w:ascii="Cambria Math" w:hAnsi="Cambria Math"/>
+                </w:rPr>
+                <m:t>s+</m:t>
+              </m:r>
+              <m:r>
+                <w:rPr>
+                  <w:rFonts w:ascii="Cambria Math" w:hAnsi="Cambria Math"/>
+                </w:rPr>
+                <m:t>3</m:t>
+              </m:r>
+            </m:num>
+            <m:den>
+              <m:sSup>
+                <m:sSupPr>
+                  <m:ctrlPr>
+                    <w:rPr>
+                      <w:rFonts w:ascii="Cambria Math" w:hAnsi="Cambria Math"/>
+                      <w:i/>
+                    </w:rPr>
+                  </m:ctrlPr>
+                </m:sSupPr>
+                <m:e>
+                  <m:d>
+                    <m:dPr>
+                      <m:ctrlPr>
+                        <w:rPr>
+                          <w:rFonts w:ascii="Cambria Math" w:hAnsi="Cambria Math"/>
+                          <w:i/>
+                        </w:rPr>
+                      </m:ctrlPr>
+                    </m:dPr>
+                    <m:e>
+                      <m:r>
+                        <w:rPr>
+                          <w:rFonts w:ascii="Cambria Math" w:hAnsi="Cambria Math"/>
+                        </w:rPr>
+                        <m:t>s-1</m:t>
+                      </m:r>
+                    </m:e>
+                  </m:d>
+                </m:e>
+                <m:sup>
+                  <m:r>
+                    <w:rPr>
+                      <w:rFonts w:ascii="Cambria Math" w:hAnsi="Cambria Math"/>
+                    </w:rPr>
+                    <m:t>2</m:t>
+                  </m:r>
+                </m:sup>
+              </m:sSup>
+            </m:den>
+          </m:f>
+        </m:oMath>
+      </m:oMathPara>
+    </w:p>
+    <w:p>
+      <w:r>
+        <w:t xml:space="preserve">Using the </w:t>
+      </w:r>
+      <w:r>
+        <w:t xml:space="preserve">solutions from Part (a), </w:t>
+      </w:r>
+      <m:oMath>
+        <m:sSubSup>
+          <m:sSubSupPr>
+            <m:ctrlPr>
+              <w:rPr>
+                <w:rFonts w:ascii="Cambria Math" w:hAnsi="Cambria Math"/>
+                <w:i/>
+              </w:rPr>
+            </m:ctrlPr>
+          </m:sSubSupPr>
+          <m:e>
+            <m:r>
+              <w:rPr>
+                <w:rFonts w:ascii="Cambria Math" w:hAnsi="Cambria Math"/>
               </w:rPr>
               <m:t>c</m:t>
             </m:r>
@@ -2531,15 +4982,15 @@
           <m:sub>
             <m:r>
               <w:rPr>
-                <w:rFonts w:ascii="Cambria Math" w:eastAsiaTheme="minorEastAsia" w:hAnsi="Cambria Math"/>
-              </w:rPr>
-              <m:t>1</m:t>
+                <w:rFonts w:ascii="Cambria Math" w:hAnsi="Cambria Math"/>
+              </w:rPr>
+              <m:t>0</m:t>
             </m:r>
           </m:sub>
           <m:sup>
             <m:r>
               <w:rPr>
-                <w:rFonts w:ascii="Cambria Math" w:eastAsiaTheme="minorEastAsia" w:hAnsi="Cambria Math"/>
+                <w:rFonts w:ascii="Cambria Math" w:hAnsi="Cambria Math"/>
               </w:rPr>
               <m:t>*</m:t>
             </m:r>
@@ -2550,7 +5001,65 @@
         <w:rPr>
           <w:rFonts w:eastAsiaTheme="minorEastAsia"/>
         </w:rPr>
-        <w:t>.</w:t>
+        <w:t xml:space="preserve">, </w:t>
+      </w:r>
+      <m:oMath>
+        <m:r>
+          <w:rPr>
+            <w:rFonts w:ascii="Cambria Math" w:eastAsiaTheme="minorEastAsia" w:hAnsi="Cambria Math"/>
+          </w:rPr>
+          <m:t>q,</m:t>
+        </m:r>
+      </m:oMath>
+      <w:r>
+        <w:rPr>
+          <w:rFonts w:eastAsiaTheme="minorEastAsia"/>
+        </w:rPr>
+        <w:t xml:space="preserve"> </w:t>
+      </w:r>
+      <w:r>
+        <w:rPr>
+          <w:rFonts w:eastAsiaTheme="minorEastAsia"/>
+        </w:rPr>
+        <w:t xml:space="preserve">and </w:t>
+      </w:r>
+      <m:oMath>
+        <m:r>
+          <w:rPr>
+            <w:rFonts w:ascii="Cambria Math" w:eastAsiaTheme="minorEastAsia" w:hAnsi="Cambria Math"/>
+          </w:rPr>
+          <m:t>λ</m:t>
+        </m:r>
+        <m:d>
+          <m:dPr>
+            <m:ctrlPr>
+              <w:rPr>
+                <w:rFonts w:ascii="Cambria Math" w:eastAsiaTheme="minorEastAsia" w:hAnsi="Cambria Math"/>
+                <w:i/>
+              </w:rPr>
+            </m:ctrlPr>
+          </m:dPr>
+          <m:e>
+            <m:r>
+              <w:rPr>
+                <w:rFonts w:ascii="Cambria Math" w:eastAsiaTheme="minorEastAsia" w:hAnsi="Cambria Math"/>
+              </w:rPr>
+              <m:t>s</m:t>
+            </m:r>
+          </m:e>
+        </m:d>
+      </m:oMath>
+      <w:r>
+        <w:rPr>
+          <w:rFonts w:eastAsiaTheme="minorEastAsia"/>
+        </w:rPr>
+        <w:t xml:space="preserve"> remain </w:t>
+      </w:r>
+      <w:r>
+        <w:rPr>
+          <w:rFonts w:eastAsiaTheme="minorEastAsia"/>
+        </w:rPr>
+        <w:t xml:space="preserve">unchanged. </w:t>
       </w:r>
     </w:p>
     <w:p>
@@ -2560,6 +5069,563 @@
           <w:rFonts w:eastAsiaTheme="minorEastAsia"/>
         </w:rPr>
       </w:pPr>
+      <m:oMathPara>
+        <m:oMath>
+          <m:r>
+            <w:rPr>
+              <w:rFonts w:ascii="Cambria Math" w:eastAsiaTheme="minorEastAsia" w:hAnsi="Cambria Math"/>
+            </w:rPr>
+            <m:t>λ</m:t>
+          </m:r>
+          <m:d>
+            <m:dPr>
+              <m:ctrlPr>
+                <w:rPr>
+                  <w:rFonts w:ascii="Cambria Math" w:eastAsiaTheme="minorEastAsia" w:hAnsi="Cambria Math"/>
+                  <w:i/>
+                </w:rPr>
+              </m:ctrlPr>
+            </m:dPr>
+            <m:e>
+              <m:r>
+                <w:rPr>
+                  <w:rFonts w:ascii="Cambria Math" w:eastAsiaTheme="minorEastAsia" w:hAnsi="Cambria Math"/>
+                </w:rPr>
+                <m:t>s</m:t>
+              </m:r>
+            </m:e>
+          </m:d>
+          <m:r>
+            <w:rPr>
+              <w:rFonts w:ascii="Cambria Math" w:eastAsiaTheme="minorEastAsia" w:hAnsi="Cambria Math"/>
+            </w:rPr>
+            <m:t>-</m:t>
+          </m:r>
+          <m:sSup>
+            <m:sSupPr>
+              <m:ctrlPr>
+                <w:rPr>
+                  <w:rFonts w:ascii="Cambria Math" w:eastAsiaTheme="minorEastAsia" w:hAnsi="Cambria Math"/>
+                  <w:i/>
+                </w:rPr>
+              </m:ctrlPr>
+            </m:sSupPr>
+            <m:e>
+              <m:r>
+                <w:rPr>
+                  <w:rFonts w:ascii="Cambria Math" w:eastAsiaTheme="minorEastAsia" w:hAnsi="Cambria Math"/>
+                </w:rPr>
+                <m:t>c</m:t>
+              </m:r>
+            </m:e>
+            <m:sup>
+              <m:r>
+                <w:rPr>
+                  <w:rFonts w:ascii="Cambria Math" w:eastAsiaTheme="minorEastAsia" w:hAnsi="Cambria Math"/>
+                </w:rPr>
+                <m:t>*</m:t>
+              </m:r>
+            </m:sup>
+          </m:sSup>
+          <m:d>
+            <m:dPr>
+              <m:ctrlPr>
+                <w:rPr>
+                  <w:rFonts w:ascii="Cambria Math" w:eastAsiaTheme="minorEastAsia" w:hAnsi="Cambria Math"/>
+                  <w:i/>
+                </w:rPr>
+              </m:ctrlPr>
+            </m:dPr>
+            <m:e>
+              <m:r>
+                <w:rPr>
+                  <w:rFonts w:ascii="Cambria Math" w:eastAsiaTheme="minorEastAsia" w:hAnsi="Cambria Math"/>
+                </w:rPr>
+                <m:t>s</m:t>
+              </m:r>
+            </m:e>
+          </m:d>
+          <m:r>
+            <w:rPr>
+              <w:rFonts w:ascii="Cambria Math" w:eastAsiaTheme="minorEastAsia" w:hAnsi="Cambria Math"/>
+            </w:rPr>
+            <m:t>=q</m:t>
+          </m:r>
+          <m:sSub>
+            <m:sSubPr>
+              <m:ctrlPr>
+                <w:rPr>
+                  <w:rFonts w:ascii="Cambria Math" w:eastAsiaTheme="minorEastAsia" w:hAnsi="Cambria Math"/>
+                  <w:i/>
+                </w:rPr>
+              </m:ctrlPr>
+            </m:sSubPr>
+            <m:e>
+              <m:r>
+                <w:rPr>
+                  <w:rFonts w:ascii="Cambria Math" w:eastAsiaTheme="minorEastAsia" w:hAnsi="Cambria Math"/>
+                </w:rPr>
+                <m:t>n</m:t>
+              </m:r>
+            </m:e>
+            <m:sub>
+              <m:r>
+                <w:rPr>
+                  <w:rFonts w:ascii="Cambria Math" w:eastAsiaTheme="minorEastAsia" w:hAnsi="Cambria Math"/>
+                </w:rPr>
+                <m:t>p</m:t>
+              </m:r>
+            </m:sub>
+          </m:sSub>
+          <m:d>
+            <m:dPr>
+              <m:ctrlPr>
+                <w:rPr>
+                  <w:rFonts w:ascii="Cambria Math" w:eastAsiaTheme="minorEastAsia" w:hAnsi="Cambria Math"/>
+                  <w:i/>
+                </w:rPr>
+              </m:ctrlPr>
+            </m:dPr>
+            <m:e>
+              <m:r>
+                <w:rPr>
+                  <w:rFonts w:ascii="Cambria Math" w:eastAsiaTheme="minorEastAsia" w:hAnsi="Cambria Math"/>
+                </w:rPr>
+                <m:t>s</m:t>
+              </m:r>
+            </m:e>
+          </m:d>
+          <m:r>
+            <w:rPr>
+              <w:rFonts w:ascii="Cambria Math" w:eastAsiaTheme="minorEastAsia" w:hAnsi="Cambria Math"/>
+            </w:rPr>
+            <m:t>→</m:t>
+          </m:r>
+          <m:sSup>
+            <m:sSupPr>
+              <m:ctrlPr>
+                <w:rPr>
+                  <w:rFonts w:ascii="Cambria Math" w:eastAsiaTheme="minorEastAsia" w:hAnsi="Cambria Math"/>
+                  <w:i/>
+                </w:rPr>
+              </m:ctrlPr>
+            </m:sSupPr>
+            <m:e>
+              <m:r>
+                <w:rPr>
+                  <w:rFonts w:ascii="Cambria Math" w:eastAsiaTheme="minorEastAsia" w:hAnsi="Cambria Math"/>
+                </w:rPr>
+                <m:t>c</m:t>
+              </m:r>
+            </m:e>
+            <m:sup>
+              <m:r>
+                <w:rPr>
+                  <w:rFonts w:ascii="Cambria Math" w:eastAsiaTheme="minorEastAsia" w:hAnsi="Cambria Math"/>
+                </w:rPr>
+                <m:t>*</m:t>
+              </m:r>
+            </m:sup>
+          </m:sSup>
+          <m:r>
+            <w:rPr>
+              <w:rFonts w:ascii="Cambria Math" w:eastAsiaTheme="minorEastAsia" w:hAnsi="Cambria Math"/>
+            </w:rPr>
+            <m:t>=</m:t>
+          </m:r>
+          <m:r>
+            <w:rPr>
+              <w:rFonts w:ascii="Cambria Math" w:eastAsiaTheme="minorEastAsia" w:hAnsi="Cambria Math"/>
+            </w:rPr>
+            <m:t>0</m:t>
+          </m:r>
+        </m:oMath>
+      </m:oMathPara>
+    </w:p>
+    <w:p>
+      <w:pPr>
+        <w:rPr>
+          <w:rFonts w:eastAsiaTheme="minorEastAsia"/>
+        </w:rPr>
+      </w:pPr>
+      <m:oMathPara>
+        <m:oMath>
+          <m:r>
+            <w:rPr>
+              <w:rFonts w:ascii="Cambria Math" w:eastAsiaTheme="minorEastAsia" w:hAnsi="Cambria Math"/>
+            </w:rPr>
+            <m:t>-</m:t>
+          </m:r>
+          <m:sSub>
+            <m:sSubPr>
+              <m:ctrlPr>
+                <w:rPr>
+                  <w:rFonts w:ascii="Cambria Math" w:eastAsiaTheme="minorEastAsia" w:hAnsi="Cambria Math"/>
+                  <w:i/>
+                </w:rPr>
+              </m:ctrlPr>
+            </m:sSubPr>
+            <m:e>
+              <m:r>
+                <w:rPr>
+                  <w:rFonts w:ascii="Cambria Math" w:eastAsiaTheme="minorEastAsia" w:hAnsi="Cambria Math"/>
+                </w:rPr>
+                <m:t>k</m:t>
+              </m:r>
+            </m:e>
+            <m:sub>
+              <m:r>
+                <w:rPr>
+                  <w:rFonts w:ascii="Cambria Math" w:eastAsiaTheme="minorEastAsia" w:hAnsi="Cambria Math"/>
+                </w:rPr>
+                <m:t>p</m:t>
+              </m:r>
+            </m:sub>
+          </m:sSub>
+          <m:sSup>
+            <m:sSupPr>
+              <m:ctrlPr>
+                <w:rPr>
+                  <w:rFonts w:ascii="Cambria Math" w:eastAsiaTheme="minorEastAsia" w:hAnsi="Cambria Math"/>
+                  <w:i/>
+                </w:rPr>
+              </m:ctrlPr>
+            </m:sSupPr>
+            <m:e>
+              <m:r>
+                <w:rPr>
+                  <w:rFonts w:ascii="Cambria Math" w:eastAsiaTheme="minorEastAsia" w:hAnsi="Cambria Math"/>
+                </w:rPr>
+                <m:t>d</m:t>
+              </m:r>
+            </m:e>
+            <m:sup>
+              <m:r>
+                <w:rPr>
+                  <w:rFonts w:ascii="Cambria Math" w:eastAsiaTheme="minorEastAsia" w:hAnsi="Cambria Math"/>
+                </w:rPr>
+                <m:t>*</m:t>
+              </m:r>
+            </m:sup>
+          </m:sSup>
+          <m:d>
+            <m:dPr>
+              <m:ctrlPr>
+                <w:rPr>
+                  <w:rFonts w:ascii="Cambria Math" w:eastAsiaTheme="minorEastAsia" w:hAnsi="Cambria Math"/>
+                  <w:i/>
+                </w:rPr>
+              </m:ctrlPr>
+            </m:dPr>
+            <m:e>
+              <m:r>
+                <w:rPr>
+                  <w:rFonts w:ascii="Cambria Math" w:eastAsiaTheme="minorEastAsia" w:hAnsi="Cambria Math"/>
+                </w:rPr>
+                <m:t>s</m:t>
+              </m:r>
+            </m:e>
+          </m:d>
+          <m:r>
+            <w:rPr>
+              <w:rFonts w:ascii="Cambria Math" w:eastAsiaTheme="minorEastAsia" w:hAnsi="Cambria Math"/>
+            </w:rPr>
+            <m:t>=</m:t>
+          </m:r>
+          <m:sSub>
+            <m:sSubPr>
+              <m:ctrlPr>
+                <w:rPr>
+                  <w:rFonts w:ascii="Cambria Math" w:eastAsiaTheme="minorEastAsia" w:hAnsi="Cambria Math"/>
+                  <w:i/>
+                </w:rPr>
+              </m:ctrlPr>
+            </m:sSubPr>
+            <m:e>
+              <m:r>
+                <w:rPr>
+                  <w:rFonts w:ascii="Cambria Math" w:eastAsiaTheme="minorEastAsia" w:hAnsi="Cambria Math"/>
+                </w:rPr>
+                <m:t>d</m:t>
+              </m:r>
+            </m:e>
+            <m:sub>
+              <m:r>
+                <w:rPr>
+                  <w:rFonts w:ascii="Cambria Math" w:eastAsiaTheme="minorEastAsia" w:hAnsi="Cambria Math"/>
+                </w:rPr>
+                <m:t>m</m:t>
+              </m:r>
+            </m:sub>
+          </m:sSub>
+          <m:d>
+            <m:dPr>
+              <m:ctrlPr>
+                <w:rPr>
+                  <w:rFonts w:ascii="Cambria Math" w:eastAsiaTheme="minorEastAsia" w:hAnsi="Cambria Math"/>
+                  <w:i/>
+                </w:rPr>
+              </m:ctrlPr>
+            </m:dPr>
+            <m:e>
+              <m:r>
+                <w:rPr>
+                  <w:rFonts w:ascii="Cambria Math" w:eastAsiaTheme="minorEastAsia" w:hAnsi="Cambria Math"/>
+                </w:rPr>
+                <m:t>s</m:t>
+              </m:r>
+            </m:e>
+          </m:d>
+          <m:r>
+            <w:rPr>
+              <w:rFonts w:ascii="Cambria Math" w:eastAsiaTheme="minorEastAsia" w:hAnsi="Cambria Math"/>
+            </w:rPr>
+            <m:t>-q</m:t>
+          </m:r>
+          <m:sSub>
+            <m:sSubPr>
+              <m:ctrlPr>
+                <w:rPr>
+                  <w:rFonts w:ascii="Cambria Math" w:eastAsiaTheme="minorEastAsia" w:hAnsi="Cambria Math"/>
+                  <w:i/>
+                </w:rPr>
+              </m:ctrlPr>
+            </m:sSubPr>
+            <m:e>
+              <m:r>
+                <w:rPr>
+                  <w:rFonts w:ascii="Cambria Math" w:eastAsiaTheme="minorEastAsia" w:hAnsi="Cambria Math"/>
+                </w:rPr>
+                <m:t>d</m:t>
+              </m:r>
+            </m:e>
+            <m:sub>
+              <m:r>
+                <w:rPr>
+                  <w:rFonts w:ascii="Cambria Math" w:eastAsiaTheme="minorEastAsia" w:hAnsi="Cambria Math"/>
+                </w:rPr>
+                <m:t>p</m:t>
+              </m:r>
+            </m:sub>
+          </m:sSub>
+          <m:d>
+            <m:dPr>
+              <m:ctrlPr>
+                <w:rPr>
+                  <w:rFonts w:ascii="Cambria Math" w:eastAsiaTheme="minorEastAsia" w:hAnsi="Cambria Math"/>
+                  <w:i/>
+                </w:rPr>
+              </m:ctrlPr>
+            </m:dPr>
+            <m:e>
+              <m:r>
+                <w:rPr>
+                  <w:rFonts w:ascii="Cambria Math" w:eastAsiaTheme="minorEastAsia" w:hAnsi="Cambria Math"/>
+                </w:rPr>
+                <m:t>s</m:t>
+              </m:r>
+            </m:e>
+          </m:d>
+          <m:r>
+            <w:rPr>
+              <w:rFonts w:ascii="Cambria Math" w:eastAsiaTheme="minorEastAsia" w:hAnsi="Cambria Math"/>
+            </w:rPr>
+            <m:t xml:space="preserve">,  </m:t>
+          </m:r>
+          <m:f>
+            <m:fPr>
+              <m:ctrlPr>
+                <w:rPr>
+                  <w:rFonts w:ascii="Cambria Math" w:eastAsiaTheme="minorEastAsia" w:hAnsi="Cambria Math"/>
+                  <w:i/>
+                </w:rPr>
+              </m:ctrlPr>
+            </m:fPr>
+            <m:num>
+              <m:sSup>
+                <m:sSupPr>
+                  <m:ctrlPr>
+                    <w:rPr>
+                      <w:rFonts w:ascii="Cambria Math" w:eastAsiaTheme="minorEastAsia" w:hAnsi="Cambria Math"/>
+                      <w:i/>
+                    </w:rPr>
+                  </m:ctrlPr>
+                </m:sSupPr>
+                <m:e>
+                  <m:r>
+                    <w:rPr>
+                      <w:rFonts w:ascii="Cambria Math" w:eastAsiaTheme="minorEastAsia" w:hAnsi="Cambria Math"/>
+                    </w:rPr>
+                    <m:t>d</m:t>
+                  </m:r>
+                </m:e>
+                <m:sup>
+                  <m:r>
+                    <w:rPr>
+                      <w:rFonts w:ascii="Cambria Math" w:eastAsiaTheme="minorEastAsia" w:hAnsi="Cambria Math"/>
+                    </w:rPr>
+                    <m:t>*</m:t>
+                  </m:r>
+                </m:sup>
+              </m:sSup>
+              <m:d>
+                <m:dPr>
+                  <m:ctrlPr>
+                    <w:rPr>
+                      <w:rFonts w:ascii="Cambria Math" w:eastAsiaTheme="minorEastAsia" w:hAnsi="Cambria Math"/>
+                      <w:i/>
+                    </w:rPr>
+                  </m:ctrlPr>
+                </m:dPr>
+                <m:e>
+                  <m:r>
+                    <w:rPr>
+                      <w:rFonts w:ascii="Cambria Math" w:eastAsiaTheme="minorEastAsia" w:hAnsi="Cambria Math"/>
+                    </w:rPr>
+                    <m:t>s</m:t>
+                  </m:r>
+                </m:e>
+              </m:d>
+            </m:num>
+            <m:den>
+              <m:r>
+                <w:rPr>
+                  <w:rFonts w:ascii="Cambria Math" w:eastAsiaTheme="minorEastAsia" w:hAnsi="Cambria Math"/>
+                </w:rPr>
+                <m:t>λ</m:t>
+              </m:r>
+              <m:d>
+                <m:dPr>
+                  <m:ctrlPr>
+                    <w:rPr>
+                      <w:rFonts w:ascii="Cambria Math" w:eastAsiaTheme="minorEastAsia" w:hAnsi="Cambria Math"/>
+                      <w:i/>
+                    </w:rPr>
+                  </m:ctrlPr>
+                </m:dPr>
+                <m:e>
+                  <m:r>
+                    <w:rPr>
+                      <w:rFonts w:ascii="Cambria Math" w:eastAsiaTheme="minorEastAsia" w:hAnsi="Cambria Math"/>
+                    </w:rPr>
+                    <m:t>s</m:t>
+                  </m:r>
+                </m:e>
+              </m:d>
+            </m:den>
+          </m:f>
+          <m:r>
+            <w:rPr>
+              <w:rFonts w:ascii="Cambria Math" w:eastAsiaTheme="minorEastAsia" w:hAnsi="Cambria Math"/>
+            </w:rPr>
+            <m:t>=</m:t>
+          </m:r>
+          <m:sSubSup>
+            <m:sSubSupPr>
+              <m:ctrlPr>
+                <w:rPr>
+                  <w:rFonts w:ascii="Cambria Math" w:eastAsiaTheme="minorEastAsia" w:hAnsi="Cambria Math"/>
+                  <w:i/>
+                </w:rPr>
+              </m:ctrlPr>
+            </m:sSubSupPr>
+            <m:e>
+              <m:r>
+                <w:rPr>
+                  <w:rFonts w:ascii="Cambria Math" w:eastAsiaTheme="minorEastAsia" w:hAnsi="Cambria Math"/>
+                </w:rPr>
+                <m:t>d</m:t>
+              </m:r>
+            </m:e>
+            <m:sub>
+              <m:r>
+                <w:rPr>
+                  <w:rFonts w:ascii="Cambria Math" w:eastAsiaTheme="minorEastAsia" w:hAnsi="Cambria Math"/>
+                </w:rPr>
+                <m:t>0</m:t>
+              </m:r>
+            </m:sub>
+            <m:sup>
+              <m:r>
+                <w:rPr>
+                  <w:rFonts w:ascii="Cambria Math" w:eastAsiaTheme="minorEastAsia" w:hAnsi="Cambria Math"/>
+                </w:rPr>
+                <m:t>*</m:t>
+              </m:r>
+            </m:sup>
+          </m:sSubSup>
+          <m:r>
+            <w:rPr>
+              <w:rFonts w:ascii="Cambria Math" w:eastAsiaTheme="minorEastAsia" w:hAnsi="Cambria Math"/>
+            </w:rPr>
+            <m:t>+</m:t>
+          </m:r>
+          <m:f>
+            <m:fPr>
+              <m:ctrlPr>
+                <w:rPr>
+                  <w:rFonts w:ascii="Cambria Math" w:eastAsiaTheme="minorEastAsia" w:hAnsi="Cambria Math"/>
+                  <w:i/>
+                </w:rPr>
+              </m:ctrlPr>
+            </m:fPr>
+            <m:num>
+              <m:sSup>
+                <m:sSupPr>
+                  <m:ctrlPr>
+                    <w:rPr>
+                      <w:rFonts w:ascii="Cambria Math" w:eastAsiaTheme="minorEastAsia" w:hAnsi="Cambria Math"/>
+                      <w:i/>
+                    </w:rPr>
+                  </m:ctrlPr>
+                </m:sSupPr>
+                <m:e>
+                  <m:r>
+                    <w:rPr>
+                      <w:rFonts w:ascii="Cambria Math" w:eastAsiaTheme="minorEastAsia" w:hAnsi="Cambria Math"/>
+                    </w:rPr>
+                    <m:t>d</m:t>
+                  </m:r>
+                </m:e>
+                <m:sup>
+                  <m:r>
+                    <w:rPr>
+                      <w:rFonts w:ascii="Cambria Math" w:eastAsiaTheme="minorEastAsia" w:hAnsi="Cambria Math"/>
+                    </w:rPr>
+                    <m:t>*</m:t>
+                  </m:r>
+                </m:sup>
+              </m:sSup>
+            </m:num>
+            <m:den>
+              <m:r>
+                <w:rPr>
+                  <w:rFonts w:ascii="Cambria Math" w:eastAsiaTheme="minorEastAsia" w:hAnsi="Cambria Math"/>
+                </w:rPr>
+                <m:t>λ</m:t>
+              </m:r>
+              <m:d>
+                <m:dPr>
+                  <m:ctrlPr>
+                    <w:rPr>
+                      <w:rFonts w:ascii="Cambria Math" w:eastAsiaTheme="minorEastAsia" w:hAnsi="Cambria Math"/>
+                      <w:i/>
+                    </w:rPr>
+                  </m:ctrlPr>
+                </m:dPr>
+                <m:e>
+                  <m:r>
+                    <w:rPr>
+                      <w:rFonts w:ascii="Cambria Math" w:eastAsiaTheme="minorEastAsia" w:hAnsi="Cambria Math"/>
+                    </w:rPr>
+                    <m:t>s</m:t>
+                  </m:r>
+                </m:e>
+              </m:d>
+            </m:den>
+          </m:f>
+        </m:oMath>
+      </m:oMathPara>
     </w:p>
     <w:p>
       <w:pPr>
@@ -2568,32 +5634,229 @@
           <w:rFonts w:eastAsiaTheme="minorEastAsia"/>
         </w:rPr>
       </w:pPr>
-      <w:r>
-        <w:rPr>
-          <w:rFonts w:eastAsiaTheme="minorEastAsia"/>
-        </w:rPr>
-        <w:t>Ultimately, the direct MRAC algorithm is able to control the plant such that the output error between the plant and model reference tends to zero.</w:t>
-      </w:r>
-      <w:r>
-        <w:rPr>
-          <w:rFonts w:eastAsiaTheme="minorEastAsia"/>
-        </w:rPr>
-        <w:t xml:space="preserve"> This is guaranteed from the direct MRAC algorithm </w:t>
-      </w:r>
-      <w:r>
-        <w:rPr>
-          <w:rFonts w:eastAsiaTheme="minorEastAsia"/>
-          <w:b/>
-          <w:bCs/>
-        </w:rPr>
-        <w:t>WHY?</w:t>
-      </w:r>
-      <w:r>
-        <w:rPr>
-          <w:rFonts w:eastAsiaTheme="minorEastAsia"/>
-        </w:rPr>
-        <w:t xml:space="preserve">. </w:t>
-      </w:r>
+      <m:oMathPara>
+        <m:oMath>
+          <m:r>
+            <w:rPr>
+              <w:rFonts w:ascii="Cambria Math" w:eastAsiaTheme="minorEastAsia" w:hAnsi="Cambria Math"/>
+            </w:rPr>
+            <w:lastRenderedPageBreak/>
+            <m:t>⇒</m:t>
+          </m:r>
+          <m:sSup>
+            <m:sSupPr>
+              <m:ctrlPr>
+                <w:rPr>
+                  <w:rFonts w:ascii="Cambria Math" w:eastAsiaTheme="minorEastAsia" w:hAnsi="Cambria Math"/>
+                  <w:i/>
+                </w:rPr>
+              </m:ctrlPr>
+            </m:sSupPr>
+            <m:e>
+              <m:r>
+                <w:rPr>
+                  <w:rFonts w:ascii="Cambria Math" w:eastAsiaTheme="minorEastAsia" w:hAnsi="Cambria Math"/>
+                </w:rPr>
+                <m:t>d</m:t>
+              </m:r>
+            </m:e>
+            <m:sup>
+              <m:r>
+                <w:rPr>
+                  <w:rFonts w:ascii="Cambria Math" w:eastAsiaTheme="minorEastAsia" w:hAnsi="Cambria Math"/>
+                </w:rPr>
+                <m:t>*</m:t>
+              </m:r>
+            </m:sup>
+          </m:sSup>
+          <m:d>
+            <m:dPr>
+              <m:ctrlPr>
+                <w:rPr>
+                  <w:rFonts w:ascii="Cambria Math" w:eastAsiaTheme="minorEastAsia" w:hAnsi="Cambria Math"/>
+                  <w:i/>
+                </w:rPr>
+              </m:ctrlPr>
+            </m:dPr>
+            <m:e>
+              <m:r>
+                <w:rPr>
+                  <w:rFonts w:ascii="Cambria Math" w:eastAsiaTheme="minorEastAsia" w:hAnsi="Cambria Math"/>
+                </w:rPr>
+                <m:t>s</m:t>
+              </m:r>
+            </m:e>
+          </m:d>
+          <m:r>
+            <w:rPr>
+              <w:rFonts w:ascii="Cambria Math" w:eastAsiaTheme="minorEastAsia" w:hAnsi="Cambria Math"/>
+            </w:rPr>
+            <m:t>= -</m:t>
+          </m:r>
+          <m:r>
+            <w:rPr>
+              <w:rFonts w:ascii="Cambria Math" w:eastAsiaTheme="minorEastAsia" w:hAnsi="Cambria Math"/>
+            </w:rPr>
+            <m:t>8</m:t>
+          </m:r>
+          <m:r>
+            <w:rPr>
+              <w:rFonts w:ascii="Cambria Math" w:eastAsiaTheme="minorEastAsia" w:hAnsi="Cambria Math"/>
+            </w:rPr>
+            <m:t xml:space="preserve">s-4,  </m:t>
+          </m:r>
+          <m:f>
+            <m:fPr>
+              <m:ctrlPr>
+                <w:rPr>
+                  <w:rFonts w:ascii="Cambria Math" w:eastAsiaTheme="minorEastAsia" w:hAnsi="Cambria Math"/>
+                  <w:i/>
+                </w:rPr>
+              </m:ctrlPr>
+            </m:fPr>
+            <m:num>
+              <m:sSup>
+                <m:sSupPr>
+                  <m:ctrlPr>
+                    <w:rPr>
+                      <w:rFonts w:ascii="Cambria Math" w:eastAsiaTheme="minorEastAsia" w:hAnsi="Cambria Math"/>
+                      <w:i/>
+                    </w:rPr>
+                  </m:ctrlPr>
+                </m:sSupPr>
+                <m:e>
+                  <m:r>
+                    <w:rPr>
+                      <w:rFonts w:ascii="Cambria Math" w:eastAsiaTheme="minorEastAsia" w:hAnsi="Cambria Math"/>
+                    </w:rPr>
+                    <m:t>d</m:t>
+                  </m:r>
+                </m:e>
+                <m:sup>
+                  <m:r>
+                    <w:rPr>
+                      <w:rFonts w:ascii="Cambria Math" w:eastAsiaTheme="minorEastAsia" w:hAnsi="Cambria Math"/>
+                    </w:rPr>
+                    <m:t>*</m:t>
+                  </m:r>
+                </m:sup>
+              </m:sSup>
+              <m:d>
+                <m:dPr>
+                  <m:ctrlPr>
+                    <w:rPr>
+                      <w:rFonts w:ascii="Cambria Math" w:eastAsiaTheme="minorEastAsia" w:hAnsi="Cambria Math"/>
+                      <w:i/>
+                    </w:rPr>
+                  </m:ctrlPr>
+                </m:dPr>
+                <m:e>
+                  <m:r>
+                    <w:rPr>
+                      <w:rFonts w:ascii="Cambria Math" w:eastAsiaTheme="minorEastAsia" w:hAnsi="Cambria Math"/>
+                    </w:rPr>
+                    <m:t>s</m:t>
+                  </m:r>
+                </m:e>
+              </m:d>
+            </m:num>
+            <m:den>
+              <m:r>
+                <w:rPr>
+                  <w:rFonts w:ascii="Cambria Math" w:eastAsiaTheme="minorEastAsia" w:hAnsi="Cambria Math"/>
+                </w:rPr>
+                <m:t>λ</m:t>
+              </m:r>
+              <m:d>
+                <m:dPr>
+                  <m:ctrlPr>
+                    <w:rPr>
+                      <w:rFonts w:ascii="Cambria Math" w:eastAsiaTheme="minorEastAsia" w:hAnsi="Cambria Math"/>
+                      <w:i/>
+                    </w:rPr>
+                  </m:ctrlPr>
+                </m:dPr>
+                <m:e>
+                  <m:r>
+                    <w:rPr>
+                      <w:rFonts w:ascii="Cambria Math" w:eastAsiaTheme="minorEastAsia" w:hAnsi="Cambria Math"/>
+                    </w:rPr>
+                    <m:t>s</m:t>
+                  </m:r>
+                </m:e>
+              </m:d>
+            </m:den>
+          </m:f>
+          <m:r>
+            <w:rPr>
+              <w:rFonts w:ascii="Cambria Math" w:eastAsiaTheme="minorEastAsia" w:hAnsi="Cambria Math"/>
+            </w:rPr>
+            <m:t>=-</m:t>
+          </m:r>
+          <m:r>
+            <w:rPr>
+              <w:rFonts w:ascii="Cambria Math" w:eastAsiaTheme="minorEastAsia" w:hAnsi="Cambria Math"/>
+            </w:rPr>
+            <m:t>8</m:t>
+          </m:r>
+          <m:r>
+            <w:rPr>
+              <w:rFonts w:ascii="Cambria Math" w:eastAsiaTheme="minorEastAsia" w:hAnsi="Cambria Math"/>
+            </w:rPr>
+            <m:t>+</m:t>
+          </m:r>
+          <m:f>
+            <m:fPr>
+              <m:ctrlPr>
+                <w:rPr>
+                  <w:rFonts w:ascii="Cambria Math" w:eastAsiaTheme="minorEastAsia" w:hAnsi="Cambria Math"/>
+                  <w:i/>
+                </w:rPr>
+              </m:ctrlPr>
+            </m:fPr>
+            <m:num>
+              <m:r>
+                <w:rPr>
+                  <w:rFonts w:ascii="Cambria Math" w:eastAsiaTheme="minorEastAsia" w:hAnsi="Cambria Math"/>
+                </w:rPr>
+                <m:t>20</m:t>
+              </m:r>
+            </m:num>
+            <m:den>
+              <m:r>
+                <w:rPr>
+                  <w:rFonts w:ascii="Cambria Math" w:eastAsiaTheme="minorEastAsia" w:hAnsi="Cambria Math"/>
+                </w:rPr>
+                <m:t>λ</m:t>
+              </m:r>
+              <m:d>
+                <m:dPr>
+                  <m:ctrlPr>
+                    <w:rPr>
+                      <w:rFonts w:ascii="Cambria Math" w:eastAsiaTheme="minorEastAsia" w:hAnsi="Cambria Math"/>
+                      <w:i/>
+                    </w:rPr>
+                  </m:ctrlPr>
+                </m:dPr>
+                <m:e>
+                  <m:r>
+                    <w:rPr>
+                      <w:rFonts w:ascii="Cambria Math" w:eastAsiaTheme="minorEastAsia" w:hAnsi="Cambria Math"/>
+                    </w:rPr>
+                    <m:t>s</m:t>
+                  </m:r>
+                </m:e>
+              </m:d>
+            </m:den>
+          </m:f>
+          <m:r>
+            <w:rPr>
+              <w:rFonts w:ascii="Cambria Math" w:eastAsiaTheme="minorEastAsia" w:hAnsi="Cambria Math"/>
+            </w:rPr>
+            <m:t xml:space="preserve"> </m:t>
+          </m:r>
+        </m:oMath>
+      </m:oMathPara>
     </w:p>
     <w:p>
       <w:pPr>
@@ -2602,70 +5865,406 @@
           <w:rFonts w:eastAsiaTheme="minorEastAsia"/>
         </w:rPr>
       </w:pPr>
-      <w:r>
-        <w:rPr>
-          <w:rFonts w:eastAsiaTheme="minorEastAsia"/>
-        </w:rPr>
-        <w:t xml:space="preserve"> </w:t>
-      </w:r>
-      <w:r>
-        <w:rPr>
-          <w:rFonts w:eastAsiaTheme="minorEastAsia"/>
-        </w:rPr>
-        <w:t>The</w:t>
-      </w:r>
-      <w:r>
-        <w:rPr>
-          <w:rFonts w:eastAsiaTheme="minorEastAsia"/>
-        </w:rPr>
-        <w:t xml:space="preserve"> parameters themselves are not approaching the nominal value.</w:t>
-      </w:r>
-      <w:r>
-        <w:rPr>
-          <w:rFonts w:eastAsiaTheme="minorEastAsia"/>
-        </w:rPr>
-        <w:t xml:space="preserve"> This seems to </w:t>
-      </w:r>
-      <w:r>
-        <w:rPr>
-          <w:rFonts w:eastAsiaTheme="minorEastAsia"/>
-        </w:rPr>
-        <w:t>be</w:t>
-      </w:r>
-      <w:r>
-        <w:rPr>
-          <w:rFonts w:eastAsiaTheme="minorEastAsia"/>
-        </w:rPr>
-        <w:t xml:space="preserve"> a matter of excitation. The current reference signal is a single sinusoidal wave. This is not enough information for the parameter solution driving the error decay to be unique. If the reference signal included two waves with different frequencies, there may be </w:t>
-      </w:r>
-      <w:r>
-        <w:rPr>
-          <w:rFonts w:eastAsiaTheme="minorEastAsia"/>
-        </w:rPr>
-        <w:t>convergence to</w:t>
-      </w:r>
-      <w:r>
-        <w:rPr>
-          <w:rFonts w:eastAsiaTheme="minorEastAsia"/>
-        </w:rPr>
-        <w:t xml:space="preserve"> the nominal values as well. </w:t>
-      </w:r>
-      <w:r>
-        <w:rPr>
-          <w:rFonts w:eastAsiaTheme="minorEastAsia"/>
-        </w:rPr>
-        <w:t xml:space="preserve"> </w:t>
-      </w:r>
+      <m:oMathPara>
+        <m:oMath>
+          <m:sSup>
+            <m:sSupPr>
+              <m:ctrlPr>
+                <w:rPr>
+                  <w:rFonts w:ascii="Cambria Math" w:eastAsiaTheme="minorEastAsia" w:hAnsi="Cambria Math"/>
+                  <w:i/>
+                </w:rPr>
+              </m:ctrlPr>
+            </m:sSupPr>
+            <m:e>
+              <m:r>
+                <w:rPr>
+                  <w:rFonts w:ascii="Cambria Math" w:eastAsiaTheme="minorEastAsia" w:hAnsi="Cambria Math"/>
+                </w:rPr>
+                <m:t>c</m:t>
+              </m:r>
+            </m:e>
+            <m:sup>
+              <m:r>
+                <w:rPr>
+                  <w:rFonts w:ascii="Cambria Math" w:eastAsiaTheme="minorEastAsia" w:hAnsi="Cambria Math"/>
+                </w:rPr>
+                <m:t>*</m:t>
+              </m:r>
+            </m:sup>
+          </m:sSup>
+          <m:r>
+            <w:rPr>
+              <w:rFonts w:ascii="Cambria Math" w:eastAsiaTheme="minorEastAsia" w:hAnsi="Cambria Math"/>
+            </w:rPr>
+            <m:t>=</m:t>
+          </m:r>
+          <m:r>
+            <w:rPr>
+              <w:rFonts w:ascii="Cambria Math" w:eastAsiaTheme="minorEastAsia" w:hAnsi="Cambria Math"/>
+            </w:rPr>
+            <m:t>0</m:t>
+          </m:r>
+          <m:r>
+            <w:rPr>
+              <w:rFonts w:ascii="Cambria Math" w:eastAsiaTheme="minorEastAsia" w:hAnsi="Cambria Math"/>
+            </w:rPr>
+            <m:t xml:space="preserve">,  </m:t>
+          </m:r>
+          <m:sSubSup>
+            <m:sSubSupPr>
+              <m:ctrlPr>
+                <w:rPr>
+                  <w:rFonts w:ascii="Cambria Math" w:eastAsiaTheme="minorEastAsia" w:hAnsi="Cambria Math"/>
+                  <w:i/>
+                </w:rPr>
+              </m:ctrlPr>
+            </m:sSubSupPr>
+            <m:e>
+              <m:r>
+                <w:rPr>
+                  <w:rFonts w:ascii="Cambria Math" w:eastAsiaTheme="minorEastAsia" w:hAnsi="Cambria Math"/>
+                </w:rPr>
+                <m:t>d</m:t>
+              </m:r>
+            </m:e>
+            <m:sub>
+              <m:r>
+                <w:rPr>
+                  <w:rFonts w:ascii="Cambria Math" w:eastAsiaTheme="minorEastAsia" w:hAnsi="Cambria Math"/>
+                </w:rPr>
+                <m:t>0</m:t>
+              </m:r>
+            </m:sub>
+            <m:sup>
+              <m:r>
+                <w:rPr>
+                  <w:rFonts w:ascii="Cambria Math" w:eastAsiaTheme="minorEastAsia" w:hAnsi="Cambria Math"/>
+                </w:rPr>
+                <m:t>*</m:t>
+              </m:r>
+            </m:sup>
+          </m:sSubSup>
+          <m:r>
+            <w:rPr>
+              <w:rFonts w:ascii="Cambria Math" w:eastAsiaTheme="minorEastAsia" w:hAnsi="Cambria Math"/>
+            </w:rPr>
+            <m:t>=-</m:t>
+          </m:r>
+          <m:r>
+            <w:rPr>
+              <w:rFonts w:ascii="Cambria Math" w:eastAsiaTheme="minorEastAsia" w:hAnsi="Cambria Math"/>
+            </w:rPr>
+            <m:t>8</m:t>
+          </m:r>
+          <m:r>
+            <w:rPr>
+              <w:rFonts w:ascii="Cambria Math" w:eastAsiaTheme="minorEastAsia" w:hAnsi="Cambria Math"/>
+            </w:rPr>
+            <m:t xml:space="preserve">,  </m:t>
+          </m:r>
+          <m:sSup>
+            <m:sSupPr>
+              <m:ctrlPr>
+                <w:rPr>
+                  <w:rFonts w:ascii="Cambria Math" w:eastAsiaTheme="minorEastAsia" w:hAnsi="Cambria Math"/>
+                  <w:i/>
+                </w:rPr>
+              </m:ctrlPr>
+            </m:sSupPr>
+            <m:e>
+              <m:r>
+                <w:rPr>
+                  <w:rFonts w:ascii="Cambria Math" w:eastAsiaTheme="minorEastAsia" w:hAnsi="Cambria Math"/>
+                </w:rPr>
+                <m:t>d</m:t>
+              </m:r>
+            </m:e>
+            <m:sup>
+              <m:r>
+                <w:rPr>
+                  <w:rFonts w:ascii="Cambria Math" w:eastAsiaTheme="minorEastAsia" w:hAnsi="Cambria Math"/>
+                </w:rPr>
+                <m:t>*</m:t>
+              </m:r>
+            </m:sup>
+          </m:sSup>
+          <m:r>
+            <w:rPr>
+              <w:rFonts w:ascii="Cambria Math" w:eastAsiaTheme="minorEastAsia" w:hAnsi="Cambria Math"/>
+            </w:rPr>
+            <m:t>=</m:t>
+          </m:r>
+          <m:r>
+            <w:rPr>
+              <w:rFonts w:ascii="Cambria Math" w:eastAsiaTheme="minorEastAsia" w:hAnsi="Cambria Math"/>
+            </w:rPr>
+            <m:t>20</m:t>
+          </m:r>
+        </m:oMath>
+      </m:oMathPara>
     </w:p>
     <w:p>
       <w:pPr>
-        <w:pStyle w:val="Heading2"/>
+        <w:jc w:val="both"/>
+        <w:rPr>
+          <w:rFonts w:eastAsiaTheme="minorEastAsia"/>
+        </w:rPr>
       </w:pPr>
       <w:r>
-        <w:t>Part (b)</w:t>
+        <w:rPr>
+          <w:rFonts w:eastAsiaTheme="minorEastAsia"/>
+        </w:rPr>
+        <w:t xml:space="preserve">The nominal controller parameters for this plant and model are </w:t>
       </w:r>
     </w:p>
-    <w:p/>
+    <w:p>
+      <w:pPr>
+        <w:jc w:val="both"/>
+        <w:rPr>
+          <w:rFonts w:eastAsiaTheme="minorEastAsia"/>
+        </w:rPr>
+      </w:pPr>
+      <m:oMathPara>
+        <m:oMath>
+          <m:sSubSup>
+            <m:sSubSupPr>
+              <m:ctrlPr>
+                <w:rPr>
+                  <w:rFonts w:ascii="Cambria Math" w:eastAsiaTheme="minorEastAsia" w:hAnsi="Cambria Math"/>
+                  <w:i/>
+                </w:rPr>
+              </m:ctrlPr>
+            </m:sSubSupPr>
+            <m:e>
+              <m:r>
+                <w:rPr>
+                  <w:rFonts w:ascii="Cambria Math" w:eastAsiaTheme="minorEastAsia" w:hAnsi="Cambria Math"/>
+                </w:rPr>
+                <m:t>c</m:t>
+              </m:r>
+            </m:e>
+            <m:sub>
+              <m:r>
+                <w:rPr>
+                  <w:rFonts w:ascii="Cambria Math" w:eastAsiaTheme="minorEastAsia" w:hAnsi="Cambria Math"/>
+                </w:rPr>
+                <m:t>0</m:t>
+              </m:r>
+            </m:sub>
+            <m:sup>
+              <m:r>
+                <w:rPr>
+                  <w:rFonts w:ascii="Cambria Math" w:eastAsiaTheme="minorEastAsia" w:hAnsi="Cambria Math"/>
+                </w:rPr>
+                <m:t>*</m:t>
+              </m:r>
+            </m:sup>
+          </m:sSubSup>
+          <m:r>
+            <w:rPr>
+              <w:rFonts w:ascii="Cambria Math" w:eastAsiaTheme="minorEastAsia" w:hAnsi="Cambria Math"/>
+            </w:rPr>
+            <m:t xml:space="preserve">=1,  </m:t>
+          </m:r>
+          <m:sSup>
+            <m:sSupPr>
+              <m:ctrlPr>
+                <w:rPr>
+                  <w:rFonts w:ascii="Cambria Math" w:eastAsiaTheme="minorEastAsia" w:hAnsi="Cambria Math"/>
+                  <w:i/>
+                </w:rPr>
+              </m:ctrlPr>
+            </m:sSupPr>
+            <m:e>
+              <m:r>
+                <w:rPr>
+                  <w:rFonts w:ascii="Cambria Math" w:eastAsiaTheme="minorEastAsia" w:hAnsi="Cambria Math"/>
+                </w:rPr>
+                <m:t>c</m:t>
+              </m:r>
+            </m:e>
+            <m:sup>
+              <m:r>
+                <w:rPr>
+                  <w:rFonts w:ascii="Cambria Math" w:eastAsiaTheme="minorEastAsia" w:hAnsi="Cambria Math"/>
+                </w:rPr>
+                <m:t>*</m:t>
+              </m:r>
+            </m:sup>
+          </m:sSup>
+          <m:r>
+            <w:rPr>
+              <w:rFonts w:ascii="Cambria Math" w:eastAsiaTheme="minorEastAsia" w:hAnsi="Cambria Math"/>
+            </w:rPr>
+            <m:t>=</m:t>
+          </m:r>
+          <m:r>
+            <w:rPr>
+              <w:rFonts w:ascii="Cambria Math" w:eastAsiaTheme="minorEastAsia" w:hAnsi="Cambria Math"/>
+            </w:rPr>
+            <m:t>0</m:t>
+          </m:r>
+          <m:r>
+            <w:rPr>
+              <w:rFonts w:ascii="Cambria Math" w:eastAsiaTheme="minorEastAsia" w:hAnsi="Cambria Math"/>
+            </w:rPr>
+            <m:t xml:space="preserve">,  </m:t>
+          </m:r>
+          <m:sSubSup>
+            <m:sSubSupPr>
+              <m:ctrlPr>
+                <w:rPr>
+                  <w:rFonts w:ascii="Cambria Math" w:eastAsiaTheme="minorEastAsia" w:hAnsi="Cambria Math"/>
+                  <w:i/>
+                </w:rPr>
+              </m:ctrlPr>
+            </m:sSubSupPr>
+            <m:e>
+              <m:r>
+                <w:rPr>
+                  <w:rFonts w:ascii="Cambria Math" w:eastAsiaTheme="minorEastAsia" w:hAnsi="Cambria Math"/>
+                </w:rPr>
+                <m:t>d</m:t>
+              </m:r>
+            </m:e>
+            <m:sub>
+              <m:r>
+                <w:rPr>
+                  <w:rFonts w:ascii="Cambria Math" w:eastAsiaTheme="minorEastAsia" w:hAnsi="Cambria Math"/>
+                </w:rPr>
+                <m:t>0</m:t>
+              </m:r>
+            </m:sub>
+            <m:sup>
+              <m:r>
+                <w:rPr>
+                  <w:rFonts w:ascii="Cambria Math" w:eastAsiaTheme="minorEastAsia" w:hAnsi="Cambria Math"/>
+                </w:rPr>
+                <m:t>*</m:t>
+              </m:r>
+            </m:sup>
+          </m:sSubSup>
+          <m:r>
+            <w:rPr>
+              <w:rFonts w:ascii="Cambria Math" w:eastAsiaTheme="minorEastAsia" w:hAnsi="Cambria Math"/>
+            </w:rPr>
+            <m:t>= -</m:t>
+          </m:r>
+          <m:r>
+            <w:rPr>
+              <w:rFonts w:ascii="Cambria Math" w:eastAsiaTheme="minorEastAsia" w:hAnsi="Cambria Math"/>
+            </w:rPr>
+            <m:t>8</m:t>
+          </m:r>
+          <m:r>
+            <w:rPr>
+              <w:rFonts w:ascii="Cambria Math" w:eastAsiaTheme="minorEastAsia" w:hAnsi="Cambria Math"/>
+            </w:rPr>
+            <m:t xml:space="preserve">,  </m:t>
+          </m:r>
+          <m:sSup>
+            <m:sSupPr>
+              <m:ctrlPr>
+                <w:rPr>
+                  <w:rFonts w:ascii="Cambria Math" w:eastAsiaTheme="minorEastAsia" w:hAnsi="Cambria Math"/>
+                  <w:i/>
+                </w:rPr>
+              </m:ctrlPr>
+            </m:sSupPr>
+            <m:e>
+              <m:r>
+                <w:rPr>
+                  <w:rFonts w:ascii="Cambria Math" w:eastAsiaTheme="minorEastAsia" w:hAnsi="Cambria Math"/>
+                </w:rPr>
+                <m:t>d</m:t>
+              </m:r>
+            </m:e>
+            <m:sup>
+              <m:r>
+                <w:rPr>
+                  <w:rFonts w:ascii="Cambria Math" w:eastAsiaTheme="minorEastAsia" w:hAnsi="Cambria Math"/>
+                </w:rPr>
+                <m:t>*</m:t>
+              </m:r>
+            </m:sup>
+          </m:sSup>
+          <m:r>
+            <w:rPr>
+              <w:rFonts w:ascii="Cambria Math" w:eastAsiaTheme="minorEastAsia" w:hAnsi="Cambria Math"/>
+            </w:rPr>
+            <m:t xml:space="preserve">= </m:t>
+          </m:r>
+          <m:r>
+            <w:rPr>
+              <w:rFonts w:ascii="Cambria Math" w:eastAsiaTheme="minorEastAsia" w:hAnsi="Cambria Math"/>
+            </w:rPr>
+            <m:t>20</m:t>
+          </m:r>
+        </m:oMath>
+      </m:oMathPara>
+    </w:p>
+    <w:p>
+      <w:pPr>
+        <w:jc w:val="both"/>
+        <w:rPr>
+          <w:rFonts w:eastAsiaTheme="minorEastAsia"/>
+        </w:rPr>
+      </w:pPr>
+      <w:r>
+        <w:rPr>
+          <w:rFonts w:eastAsiaTheme="minorEastAsia"/>
+        </w:rPr>
+        <w:t xml:space="preserve">In this case, the plant and model have identical zeros, which is why </w:t>
+      </w:r>
+      <m:oMath>
+        <m:sSup>
+          <m:sSupPr>
+            <m:ctrlPr>
+              <w:rPr>
+                <w:rFonts w:ascii="Cambria Math" w:eastAsiaTheme="minorEastAsia" w:hAnsi="Cambria Math"/>
+                <w:i/>
+              </w:rPr>
+            </m:ctrlPr>
+          </m:sSupPr>
+          <m:e>
+            <m:r>
+              <w:rPr>
+                <w:rFonts w:ascii="Cambria Math" w:eastAsiaTheme="minorEastAsia" w:hAnsi="Cambria Math"/>
+              </w:rPr>
+              <m:t>c</m:t>
+            </m:r>
+          </m:e>
+          <m:sup>
+            <m:r>
+              <w:rPr>
+                <w:rFonts w:ascii="Cambria Math" w:eastAsiaTheme="minorEastAsia" w:hAnsi="Cambria Math"/>
+              </w:rPr>
+              <m:t>*</m:t>
+            </m:r>
+          </m:sup>
+        </m:sSup>
+        <m:r>
+          <w:rPr>
+            <w:rFonts w:ascii="Cambria Math" w:eastAsiaTheme="minorEastAsia" w:hAnsi="Cambria Math"/>
+          </w:rPr>
+          <m:t>=0</m:t>
+        </m:r>
+      </m:oMath>
+      <w:r>
+        <w:rPr>
+          <w:rFonts w:eastAsiaTheme="minorEastAsia"/>
+        </w:rPr>
+        <w:t xml:space="preserve">. </w:t>
+      </w:r>
+    </w:p>
+    <w:p>
+      <w:pPr>
+        <w:rPr>
+          <w:rFonts w:eastAsiaTheme="minorEastAsia"/>
+        </w:rPr>
+      </w:pPr>
+    </w:p>
     <w:p>
       <w:pPr>
         <w:pStyle w:val="Heading1"/>
@@ -2730,6 +6329,38 @@
                   <w:rFonts w:ascii="Cambria Math" w:hAnsi="Cambria Math"/>
                 </w:rPr>
                 <m:t>z-a</m:t>
+              </m:r>
+            </m:den>
+          </m:f>
+          <m:r>
+            <w:rPr>
+              <w:rFonts w:ascii="Cambria Math" w:hAnsi="Cambria Math"/>
+            </w:rPr>
+            <m:t>=</m:t>
+          </m:r>
+          <m:f>
+            <m:fPr>
+              <m:ctrlPr>
+                <w:rPr>
+                  <w:rFonts w:ascii="Cambria Math" w:hAnsi="Cambria Math"/>
+                  <w:i/>
+                </w:rPr>
+              </m:ctrlPr>
+            </m:fPr>
+            <m:num>
+              <m:r>
+                <w:rPr>
+                  <w:rFonts w:ascii="Cambria Math" w:hAnsi="Cambria Math"/>
+                </w:rPr>
+                <m:t>0.0952</m:t>
+              </m:r>
+            </m:num>
+            <m:den>
+              <m:r>
+                <w:rPr>
+                  <w:rFonts w:ascii="Cambria Math" w:hAnsi="Cambria Math"/>
+                </w:rPr>
+                <m:t>z-0.9048</m:t>
               </m:r>
             </m:den>
           </m:f>
@@ -2833,6 +6464,38 @@
                   </m:r>
                 </m:sub>
               </m:sSub>
+            </m:den>
+          </m:f>
+          <m:r>
+            <w:rPr>
+              <w:rFonts w:ascii="Cambria Math" w:hAnsi="Cambria Math"/>
+            </w:rPr>
+            <m:t>=</m:t>
+          </m:r>
+          <m:f>
+            <m:fPr>
+              <m:ctrlPr>
+                <w:rPr>
+                  <w:rFonts w:ascii="Cambria Math" w:hAnsi="Cambria Math"/>
+                  <w:i/>
+                </w:rPr>
+              </m:ctrlPr>
+            </m:fPr>
+            <m:num>
+              <m:r>
+                <w:rPr>
+                  <w:rFonts w:ascii="Cambria Math" w:hAnsi="Cambria Math"/>
+                </w:rPr>
+                <m:t>0.2592</m:t>
+              </m:r>
+            </m:num>
+            <m:den>
+              <m:r>
+                <w:rPr>
+                  <w:rFonts w:ascii="Cambria Math" w:hAnsi="Cambria Math"/>
+                </w:rPr>
+                <m:t>z-0.7408</m:t>
+              </m:r>
             </m:den>
           </m:f>
         </m:oMath>
@@ -2843,12 +6506,12 @@
         <w:pStyle w:val="Heading2"/>
       </w:pPr>
       <w:r>
-        <w:lastRenderedPageBreak/>
         <w:t>Part (a)</w:t>
       </w:r>
     </w:p>
     <w:p>
       <w:pPr>
+        <w:ind w:firstLine="720"/>
         <w:jc w:val="both"/>
         <w:rPr>
           <w:rFonts w:eastAsiaTheme="minorEastAsia"/>
@@ -4470,6 +8133,7 @@
         <w:rPr>
           <w:rFonts w:eastAsiaTheme="minorEastAsia"/>
         </w:rPr>
+        <w:lastRenderedPageBreak/>
         <w:t xml:space="preserve">Having </w:t>
       </w:r>
       <m:oMath>
@@ -4720,26 +8384,8 @@
                 <w:rPr>
                   <w:rFonts w:ascii="Cambria Math" w:eastAsiaTheme="minorEastAsia" w:hAnsi="Cambria Math"/>
                 </w:rPr>
-                <m:t>P</m:t>
-              </m:r>
-              <m:d>
-                <m:dPr>
-                  <m:ctrlPr>
-                    <w:rPr>
-                      <w:rFonts w:ascii="Cambria Math" w:eastAsiaTheme="minorEastAsia" w:hAnsi="Cambria Math"/>
-                      <w:i/>
-                    </w:rPr>
-                  </m:ctrlPr>
-                </m:dPr>
-                <m:e>
-                  <m:r>
-                    <w:rPr>
-                      <w:rFonts w:ascii="Cambria Math" w:eastAsiaTheme="minorEastAsia" w:hAnsi="Cambria Math"/>
-                    </w:rPr>
-                    <m:t>z</m:t>
-                  </m:r>
-                </m:e>
-              </m:d>
+                <m:t>b</m:t>
+              </m:r>
               <m:sSub>
                 <m:sSubPr>
                   <m:ctrlPr>
@@ -4772,26 +8418,8 @@
                 <w:rPr>
                   <w:rFonts w:ascii="Cambria Math" w:eastAsiaTheme="minorEastAsia" w:hAnsi="Cambria Math"/>
                 </w:rPr>
-                <m:t>1-P</m:t>
-              </m:r>
-              <m:d>
-                <m:dPr>
-                  <m:ctrlPr>
-                    <w:rPr>
-                      <w:rFonts w:ascii="Cambria Math" w:eastAsiaTheme="minorEastAsia" w:hAnsi="Cambria Math"/>
-                      <w:i/>
-                    </w:rPr>
-                  </m:ctrlPr>
-                </m:dPr>
-                <m:e>
-                  <m:r>
-                    <w:rPr>
-                      <w:rFonts w:ascii="Cambria Math" w:eastAsiaTheme="minorEastAsia" w:hAnsi="Cambria Math"/>
-                    </w:rPr>
-                    <m:t>z</m:t>
-                  </m:r>
-                </m:e>
-              </m:d>
+                <m:t>z-a-b</m:t>
+              </m:r>
               <m:sSub>
                 <m:sSubPr>
                   <m:ctrlPr>
@@ -4910,84 +8538,38 @@
       </w:pPr>
       <m:oMathPara>
         <m:oMath>
-          <m:f>
-            <m:fPr>
-              <m:ctrlPr>
-                <w:rPr>
-                  <w:rFonts w:ascii="Cambria Math" w:eastAsiaTheme="minorEastAsia" w:hAnsi="Cambria Math"/>
-                  <w:i/>
-                </w:rPr>
-              </m:ctrlPr>
-            </m:fPr>
-            <m:num>
-              <m:r>
-                <w:rPr>
-                  <w:rFonts w:ascii="Cambria Math" w:eastAsiaTheme="minorEastAsia" w:hAnsi="Cambria Math"/>
-                </w:rPr>
-                <m:t>b</m:t>
-              </m:r>
-              <m:sSub>
-                <m:sSubPr>
-                  <m:ctrlPr>
-                    <w:rPr>
-                      <w:rFonts w:ascii="Cambria Math" w:eastAsiaTheme="minorEastAsia" w:hAnsi="Cambria Math"/>
-                      <w:i/>
-                    </w:rPr>
-                  </m:ctrlPr>
-                </m:sSubPr>
-                <m:e>
-                  <m:r>
-                    <w:rPr>
-                      <w:rFonts w:ascii="Cambria Math" w:eastAsiaTheme="minorEastAsia" w:hAnsi="Cambria Math"/>
-                    </w:rPr>
-                    <m:t>c</m:t>
-                  </m:r>
-                </m:e>
-                <m:sub>
-                  <m:r>
-                    <w:rPr>
-                      <w:rFonts w:ascii="Cambria Math" w:eastAsiaTheme="minorEastAsia" w:hAnsi="Cambria Math"/>
-                    </w:rPr>
-                    <m:t>0</m:t>
-                  </m:r>
-                </m:sub>
-              </m:sSub>
-            </m:num>
-            <m:den>
-              <m:r>
-                <w:rPr>
-                  <w:rFonts w:ascii="Cambria Math" w:eastAsiaTheme="minorEastAsia" w:hAnsi="Cambria Math"/>
-                </w:rPr>
-                <m:t>z-a-b</m:t>
-              </m:r>
-              <m:sSub>
-                <m:sSubPr>
-                  <m:ctrlPr>
-                    <w:rPr>
-                      <w:rFonts w:ascii="Cambria Math" w:eastAsiaTheme="minorEastAsia" w:hAnsi="Cambria Math"/>
-                      <w:i/>
-                    </w:rPr>
-                  </m:ctrlPr>
-                </m:sSubPr>
-                <m:e>
-                  <m:r>
-                    <w:rPr>
-                      <w:rFonts w:ascii="Cambria Math" w:eastAsiaTheme="minorEastAsia" w:hAnsi="Cambria Math"/>
-                    </w:rPr>
-                    <m:t>d</m:t>
-                  </m:r>
-                </m:e>
-                <m:sub>
-                  <m:r>
-                    <w:rPr>
-                      <w:rFonts w:ascii="Cambria Math" w:eastAsiaTheme="minorEastAsia" w:hAnsi="Cambria Math"/>
-                    </w:rPr>
-                    <m:t>0</m:t>
-                  </m:r>
-                </m:sub>
-              </m:sSub>
-            </m:den>
-          </m:f>
+          <m:r>
+            <w:rPr>
+              <w:rFonts w:ascii="Cambria Math" w:eastAsiaTheme="minorEastAsia" w:hAnsi="Cambria Math"/>
+            </w:rPr>
+            <m:t>⇒</m:t>
+          </m:r>
+          <m:sSub>
+            <m:sSubPr>
+              <m:ctrlPr>
+                <w:rPr>
+                  <w:rFonts w:ascii="Cambria Math" w:eastAsiaTheme="minorEastAsia" w:hAnsi="Cambria Math"/>
+                  <w:i/>
+                </w:rPr>
+              </m:ctrlPr>
+            </m:sSubPr>
+            <m:e>
+              <m:r>
+                <w:rPr>
+                  <w:rFonts w:ascii="Cambria Math" w:eastAsiaTheme="minorEastAsia" w:hAnsi="Cambria Math"/>
+                </w:rPr>
+                <m:t>c</m:t>
+              </m:r>
+            </m:e>
+            <m:sub>
+              <m:r>
+                <w:rPr>
+                  <w:rFonts w:ascii="Cambria Math" w:eastAsiaTheme="minorEastAsia" w:hAnsi="Cambria Math"/>
+                </w:rPr>
+                <m:t>0</m:t>
+              </m:r>
+            </m:sub>
+          </m:sSub>
           <m:r>
             <w:rPr>
               <w:rFonts w:ascii="Cambria Math" w:eastAsiaTheme="minorEastAsia" w:hAnsi="Cambria Math"/>
@@ -5036,8 +8618,70 @@
                 <w:rPr>
                   <w:rFonts w:ascii="Cambria Math" w:eastAsiaTheme="minorEastAsia" w:hAnsi="Cambria Math"/>
                 </w:rPr>
-                <m:t>z-</m:t>
-              </m:r>
+                <m:t>b</m:t>
+              </m:r>
+            </m:den>
+          </m:f>
+          <m:r>
+            <w:rPr>
+              <w:rFonts w:ascii="Cambria Math" w:eastAsiaTheme="minorEastAsia" w:hAnsi="Cambria Math"/>
+            </w:rPr>
+            <m:t>=</m:t>
+          </m:r>
+          <m:r>
+            <w:rPr>
+              <w:rFonts w:ascii="Cambria Math" w:eastAsiaTheme="minorEastAsia" w:hAnsi="Cambria Math"/>
+            </w:rPr>
+            <m:t>2.7227</m:t>
+          </m:r>
+          <m:r>
+            <w:rPr>
+              <w:rFonts w:ascii="Cambria Math" w:eastAsiaTheme="minorEastAsia" w:hAnsi="Cambria Math"/>
+            </w:rPr>
+            <m:t xml:space="preserve">,  </m:t>
+          </m:r>
+          <m:sSub>
+            <m:sSubPr>
+              <m:ctrlPr>
+                <w:rPr>
+                  <w:rFonts w:ascii="Cambria Math" w:eastAsiaTheme="minorEastAsia" w:hAnsi="Cambria Math"/>
+                  <w:i/>
+                </w:rPr>
+              </m:ctrlPr>
+            </m:sSubPr>
+            <m:e>
+              <m:r>
+                <w:rPr>
+                  <w:rFonts w:ascii="Cambria Math" w:eastAsiaTheme="minorEastAsia" w:hAnsi="Cambria Math"/>
+                </w:rPr>
+                <m:t>d</m:t>
+              </m:r>
+            </m:e>
+            <m:sub>
+              <m:r>
+                <w:rPr>
+                  <w:rFonts w:ascii="Cambria Math" w:eastAsiaTheme="minorEastAsia" w:hAnsi="Cambria Math"/>
+                </w:rPr>
+                <m:t>0</m:t>
+              </m:r>
+            </m:sub>
+          </m:sSub>
+          <m:r>
+            <w:rPr>
+              <w:rFonts w:ascii="Cambria Math" w:eastAsiaTheme="minorEastAsia" w:hAnsi="Cambria Math"/>
+            </w:rPr>
+            <m:t>=</m:t>
+          </m:r>
+          <m:f>
+            <m:fPr>
+              <m:ctrlPr>
+                <w:rPr>
+                  <w:rFonts w:ascii="Cambria Math" w:eastAsiaTheme="minorEastAsia" w:hAnsi="Cambria Math"/>
+                  <w:i/>
+                </w:rPr>
+              </m:ctrlPr>
+            </m:fPr>
+            <m:num>
               <m:sSub>
                 <m:sSubPr>
                   <m:ctrlPr>
@@ -5064,8 +8708,34 @@
                   </m:r>
                 </m:sub>
               </m:sSub>
+              <m:r>
+                <w:rPr>
+                  <w:rFonts w:ascii="Cambria Math" w:eastAsiaTheme="minorEastAsia" w:hAnsi="Cambria Math"/>
+                </w:rPr>
+                <m:t>-a</m:t>
+              </m:r>
+            </m:num>
+            <m:den>
+              <m:r>
+                <w:rPr>
+                  <w:rFonts w:ascii="Cambria Math" w:eastAsiaTheme="minorEastAsia" w:hAnsi="Cambria Math"/>
+                </w:rPr>
+                <m:t>b</m:t>
+              </m:r>
             </m:den>
           </m:f>
+          <m:r>
+            <w:rPr>
+              <w:rFonts w:ascii="Cambria Math" w:eastAsiaTheme="minorEastAsia" w:hAnsi="Cambria Math"/>
+            </w:rPr>
+            <m:t>=</m:t>
+          </m:r>
+          <m:r>
+            <w:rPr>
+              <w:rFonts w:ascii="Cambria Math" w:eastAsiaTheme="minorEastAsia" w:hAnsi="Cambria Math"/>
+            </w:rPr>
+            <m:t>-1.7227</m:t>
+          </m:r>
         </m:oMath>
       </m:oMathPara>
     </w:p>
@@ -5076,165 +8746,10 @@
           <w:rFonts w:eastAsiaTheme="minorEastAsia"/>
         </w:rPr>
       </w:pPr>
-      <m:oMathPara>
-        <m:oMath>
-          <m:r>
-            <w:rPr>
-              <w:rFonts w:ascii="Cambria Math" w:eastAsiaTheme="minorEastAsia" w:hAnsi="Cambria Math"/>
-            </w:rPr>
-            <m:t>⇒</m:t>
-          </m:r>
-          <m:sSub>
-            <m:sSubPr>
-              <m:ctrlPr>
-                <w:rPr>
-                  <w:rFonts w:ascii="Cambria Math" w:eastAsiaTheme="minorEastAsia" w:hAnsi="Cambria Math"/>
-                  <w:i/>
-                </w:rPr>
-              </m:ctrlPr>
-            </m:sSubPr>
-            <m:e>
-              <m:r>
-                <w:rPr>
-                  <w:rFonts w:ascii="Cambria Math" w:eastAsiaTheme="minorEastAsia" w:hAnsi="Cambria Math"/>
-                </w:rPr>
-                <m:t>c</m:t>
-              </m:r>
-            </m:e>
-            <m:sub>
-              <m:r>
-                <w:rPr>
-                  <w:rFonts w:ascii="Cambria Math" w:eastAsiaTheme="minorEastAsia" w:hAnsi="Cambria Math"/>
-                </w:rPr>
-                <m:t>0</m:t>
-              </m:r>
-            </m:sub>
-          </m:sSub>
-          <m:r>
-            <w:rPr>
-              <w:rFonts w:ascii="Cambria Math" w:eastAsiaTheme="minorEastAsia" w:hAnsi="Cambria Math"/>
-            </w:rPr>
-            <m:t>=</m:t>
-          </m:r>
-          <m:f>
-            <m:fPr>
-              <m:ctrlPr>
-                <w:rPr>
-                  <w:rFonts w:ascii="Cambria Math" w:eastAsiaTheme="minorEastAsia" w:hAnsi="Cambria Math"/>
-                  <w:i/>
-                </w:rPr>
-              </m:ctrlPr>
-            </m:fPr>
-            <m:num>
-              <m:sSub>
-                <m:sSubPr>
-                  <m:ctrlPr>
-                    <w:rPr>
-                      <w:rFonts w:ascii="Cambria Math" w:eastAsiaTheme="minorEastAsia" w:hAnsi="Cambria Math"/>
-                      <w:i/>
-                    </w:rPr>
-                  </m:ctrlPr>
-                </m:sSubPr>
-                <m:e>
-                  <m:r>
-                    <w:rPr>
-                      <w:rFonts w:ascii="Cambria Math" w:eastAsiaTheme="minorEastAsia" w:hAnsi="Cambria Math"/>
-                    </w:rPr>
-                    <m:t>b</m:t>
-                  </m:r>
-                </m:e>
-                <m:sub>
-                  <m:r>
-                    <w:rPr>
-                      <w:rFonts w:ascii="Cambria Math" w:eastAsiaTheme="minorEastAsia" w:hAnsi="Cambria Math"/>
-                    </w:rPr>
-                    <m:t>m</m:t>
-                  </m:r>
-                </m:sub>
-              </m:sSub>
-            </m:num>
-            <m:den>
-              <m:r>
-                <w:rPr>
-                  <w:rFonts w:ascii="Cambria Math" w:eastAsiaTheme="minorEastAsia" w:hAnsi="Cambria Math"/>
-                </w:rPr>
-                <m:t>b</m:t>
-              </m:r>
-            </m:den>
-          </m:f>
-          <m:r>
-            <w:rPr>
-              <w:rFonts w:ascii="Cambria Math" w:eastAsiaTheme="minorEastAsia" w:hAnsi="Cambria Math"/>
-            </w:rPr>
-            <m:t>,  d0=</m:t>
-          </m:r>
-          <m:f>
-            <m:fPr>
-              <m:ctrlPr>
-                <w:rPr>
-                  <w:rFonts w:ascii="Cambria Math" w:eastAsiaTheme="minorEastAsia" w:hAnsi="Cambria Math"/>
-                  <w:i/>
-                </w:rPr>
-              </m:ctrlPr>
-            </m:fPr>
-            <m:num>
-              <m:sSub>
-                <m:sSubPr>
-                  <m:ctrlPr>
-                    <w:rPr>
-                      <w:rFonts w:ascii="Cambria Math" w:eastAsiaTheme="minorEastAsia" w:hAnsi="Cambria Math"/>
-                      <w:i/>
-                    </w:rPr>
-                  </m:ctrlPr>
-                </m:sSubPr>
-                <m:e>
-                  <m:r>
-                    <w:rPr>
-                      <w:rFonts w:ascii="Cambria Math" w:eastAsiaTheme="minorEastAsia" w:hAnsi="Cambria Math"/>
-                    </w:rPr>
-                    <m:t>a</m:t>
-                  </m:r>
-                </m:e>
-                <m:sub>
-                  <m:r>
-                    <w:rPr>
-                      <w:rFonts w:ascii="Cambria Math" w:eastAsiaTheme="minorEastAsia" w:hAnsi="Cambria Math"/>
-                    </w:rPr>
-                    <m:t>m</m:t>
-                  </m:r>
-                </m:sub>
-              </m:sSub>
-              <m:r>
-                <w:rPr>
-                  <w:rFonts w:ascii="Cambria Math" w:eastAsiaTheme="minorEastAsia" w:hAnsi="Cambria Math"/>
-                </w:rPr>
-                <m:t>-a</m:t>
-              </m:r>
-            </m:num>
-            <m:den>
-              <m:r>
-                <w:rPr>
-                  <w:rFonts w:ascii="Cambria Math" w:eastAsiaTheme="minorEastAsia" w:hAnsi="Cambria Math"/>
-                </w:rPr>
-                <m:t>b</m:t>
-              </m:r>
-            </m:den>
-          </m:f>
-        </m:oMath>
-      </m:oMathPara>
-    </w:p>
-    <w:p>
-      <w:pPr>
-        <w:jc w:val="both"/>
-        <w:rPr>
-          <w:rFonts w:eastAsiaTheme="minorEastAsia"/>
-        </w:rPr>
-      </w:pPr>
-      <w:r>
-        <w:rPr>
-          <w:rFonts w:eastAsiaTheme="minorEastAsia"/>
-        </w:rPr>
-        <w:lastRenderedPageBreak/>
+      <w:r>
+        <w:rPr>
+          <w:rFonts w:eastAsiaTheme="minorEastAsia"/>
+        </w:rPr>
         <w:t xml:space="preserve">The expression presented do show singularities at </w:t>
       </w:r>
       <m:oMath>
@@ -5288,6 +8803,7 @@
     </w:p>
     <w:p>
       <w:pPr>
+        <w:ind w:firstLine="720"/>
         <w:jc w:val="both"/>
         <w:rPr>
           <w:rFonts w:eastAsiaTheme="minorEastAsia"/>
@@ -5390,6 +8906,18 @@
           <w:rFonts w:eastAsiaTheme="minorEastAsia"/>
         </w:rPr>
         <w:t>, the adaptive control algorithm is</w:t>
+      </w:r>
+      <w:r>
+        <w:rPr>
+          <w:rFonts w:eastAsiaTheme="minorEastAsia"/>
+        </w:rPr>
+        <w:t xml:space="preserve"> shown below. </w:t>
+      </w:r>
+      <w:r>
+        <w:rPr>
+          <w:rFonts w:eastAsiaTheme="minorEastAsia"/>
+        </w:rPr>
+        <w:t>The parameter estimates are the results of the RLSFF algorithm.</w:t>
       </w:r>
     </w:p>
     <w:p>
@@ -6009,12 +9537,6 @@
           <w:rFonts w:eastAsiaTheme="minorEastAsia"/>
         </w:rPr>
       </w:pPr>
-      <w:r>
-        <w:rPr>
-          <w:rFonts w:eastAsiaTheme="minorEastAsia"/>
-        </w:rPr>
-        <w:t>The parameter estimates are the results of the RLSFF algorithm.</w:t>
-      </w:r>
     </w:p>
     <w:p>
       <w:pPr>
@@ -6031,6 +9553,39 @@
       </w:r>
     </w:p>
     <w:p/>
+    <w:p>
+      <w:r>
+        <w:br w:type="page"/>
+      </w:r>
+    </w:p>
+    <w:p>
+      <w:pPr>
+        <w:pStyle w:val="Heading1"/>
+      </w:pPr>
+      <w:r>
+        <w:lastRenderedPageBreak/>
+        <w:t xml:space="preserve">Appendix: </w:t>
+      </w:r>
+      <w:r>
+        <w:t>Simulink Models</w:t>
+      </w:r>
+    </w:p>
+    <w:p>
+      <w:r>
+        <w:t xml:space="preserve">The Simulink models and all images used in this report can be found at: </w:t>
+      </w:r>
+      <w:hyperlink r:id="rId11" w:history="1">
+        <w:r>
+          <w:rPr>
+            <w:rStyle w:val="Hyperlink"/>
+          </w:rPr>
+          <w:t>https://github.com/QuiteFiber93/eel6616/tree/main/takehome3</w:t>
+        </w:r>
+      </w:hyperlink>
+      <w:r>
+        <w:t xml:space="preserve"> </w:t>
+      </w:r>
+    </w:p>
     <w:sectPr>
       <w:pgSz w:w="12240" w:h="15840"/>
       <w:pgMar w:top="1440" w:right="1440" w:bottom="1440" w:left="1440" w:header="720" w:footer="720" w:gutter="0"/>
@@ -6491,7 +10046,6 @@
     <w:next w:val="Normal"/>
     <w:link w:val="Heading3Char"/>
     <w:uiPriority w:val="9"/>
-    <w:semiHidden/>
     <w:unhideWhenUsed/>
     <w:qFormat/>
     <w:rsid w:val="00F73798"/>
@@ -6698,7 +10252,6 @@
     <w:basedOn w:val="DefaultParagraphFont"/>
     <w:link w:val="Heading3"/>
     <w:uiPriority w:val="9"/>
-    <w:semiHidden/>
     <w:rsid w:val="00F73798"/>
     <w:rPr>
       <w:rFonts w:eastAsiaTheme="majorEastAsia" w:cstheme="majorBidi"/>
@@ -6964,6 +10517,379 @@
     <w:rsid w:val="004F142A"/>
     <w:rPr>
       <w:color w:val="666666"/>
+    </w:rPr>
+  </w:style>
+  <w:style w:type="table" w:styleId="TableGrid">
+    <w:name w:val="Table Grid"/>
+    <w:basedOn w:val="TableNormal"/>
+    <w:uiPriority w:val="39"/>
+    <w:rsid w:val="00E15EC1"/>
+    <w:pPr>
+      <w:spacing w:after="0" w:line="240" w:lineRule="auto"/>
+    </w:pPr>
+    <w:tblPr>
+      <w:tblBorders>
+        <w:top w:val="single" w:sz="4" w:space="0" w:color="auto"/>
+        <w:left w:val="single" w:sz="4" w:space="0" w:color="auto"/>
+        <w:bottom w:val="single" w:sz="4" w:space="0" w:color="auto"/>
+        <w:right w:val="single" w:sz="4" w:space="0" w:color="auto"/>
+        <w:insideH w:val="single" w:sz="4" w:space="0" w:color="auto"/>
+        <w:insideV w:val="single" w:sz="4" w:space="0" w:color="auto"/>
+      </w:tblBorders>
+    </w:tblPr>
+  </w:style>
+  <w:style w:type="table" w:styleId="PlainTable5">
+    <w:name w:val="Plain Table 5"/>
+    <w:basedOn w:val="TableNormal"/>
+    <w:uiPriority w:val="45"/>
+    <w:rsid w:val="004207FD"/>
+    <w:pPr>
+      <w:spacing w:after="0" w:line="240" w:lineRule="auto"/>
+    </w:pPr>
+    <w:tblPr>
+      <w:tblStyleRowBandSize w:val="1"/>
+      <w:tblStyleColBandSize w:val="1"/>
+    </w:tblPr>
+    <w:tblStylePr w:type="firstRow">
+      <w:rPr>
+        <w:rFonts w:asciiTheme="majorHAnsi" w:eastAsiaTheme="majorEastAsia" w:hAnsiTheme="majorHAnsi" w:cstheme="majorBidi"/>
+        <w:i/>
+        <w:iCs/>
+        <w:sz w:val="26"/>
+      </w:rPr>
+      <w:tblPr/>
+      <w:tcPr>
+        <w:tcBorders>
+          <w:bottom w:val="single" w:sz="4" w:space="0" w:color="7F7F7F" w:themeColor="text1" w:themeTint="80"/>
+        </w:tcBorders>
+        <w:shd w:val="clear" w:color="auto" w:fill="FFFFFF" w:themeFill="background1"/>
+      </w:tcPr>
+    </w:tblStylePr>
+    <w:tblStylePr w:type="lastRow">
+      <w:rPr>
+        <w:rFonts w:asciiTheme="majorHAnsi" w:eastAsiaTheme="majorEastAsia" w:hAnsiTheme="majorHAnsi" w:cstheme="majorBidi"/>
+        <w:i/>
+        <w:iCs/>
+        <w:sz w:val="26"/>
+      </w:rPr>
+      <w:tblPr/>
+      <w:tcPr>
+        <w:tcBorders>
+          <w:top w:val="single" w:sz="4" w:space="0" w:color="7F7F7F" w:themeColor="text1" w:themeTint="80"/>
+        </w:tcBorders>
+        <w:shd w:val="clear" w:color="auto" w:fill="FFFFFF" w:themeFill="background1"/>
+      </w:tcPr>
+    </w:tblStylePr>
+    <w:tblStylePr w:type="firstCol">
+      <w:pPr>
+        <w:jc w:val="right"/>
+      </w:pPr>
+      <w:rPr>
+        <w:rFonts w:asciiTheme="majorHAnsi" w:eastAsiaTheme="majorEastAsia" w:hAnsiTheme="majorHAnsi" w:cstheme="majorBidi"/>
+        <w:i/>
+        <w:iCs/>
+        <w:sz w:val="26"/>
+      </w:rPr>
+      <w:tblPr/>
+      <w:tcPr>
+        <w:tcBorders>
+          <w:right w:val="single" w:sz="4" w:space="0" w:color="7F7F7F" w:themeColor="text1" w:themeTint="80"/>
+        </w:tcBorders>
+        <w:shd w:val="clear" w:color="auto" w:fill="FFFFFF" w:themeFill="background1"/>
+      </w:tcPr>
+    </w:tblStylePr>
+    <w:tblStylePr w:type="lastCol">
+      <w:rPr>
+        <w:rFonts w:asciiTheme="majorHAnsi" w:eastAsiaTheme="majorEastAsia" w:hAnsiTheme="majorHAnsi" w:cstheme="majorBidi"/>
+        <w:i/>
+        <w:iCs/>
+        <w:sz w:val="26"/>
+      </w:rPr>
+      <w:tblPr/>
+      <w:tcPr>
+        <w:tcBorders>
+          <w:left w:val="single" w:sz="4" w:space="0" w:color="7F7F7F" w:themeColor="text1" w:themeTint="80"/>
+        </w:tcBorders>
+        <w:shd w:val="clear" w:color="auto" w:fill="FFFFFF" w:themeFill="background1"/>
+      </w:tcPr>
+    </w:tblStylePr>
+    <w:tblStylePr w:type="band1Vert">
+      <w:tblPr/>
+      <w:tcPr>
+        <w:shd w:val="clear" w:color="auto" w:fill="F2F2F2" w:themeFill="background1" w:themeFillShade="F2"/>
+      </w:tcPr>
+    </w:tblStylePr>
+    <w:tblStylePr w:type="band1Horz">
+      <w:tblPr/>
+      <w:tcPr>
+        <w:shd w:val="clear" w:color="auto" w:fill="F2F2F2" w:themeFill="background1" w:themeFillShade="F2"/>
+      </w:tcPr>
+    </w:tblStylePr>
+    <w:tblStylePr w:type="neCell">
+      <w:tblPr/>
+      <w:tcPr>
+        <w:tcBorders>
+          <w:left w:val="nil"/>
+        </w:tcBorders>
+      </w:tcPr>
+    </w:tblStylePr>
+    <w:tblStylePr w:type="nwCell">
+      <w:tblPr/>
+      <w:tcPr>
+        <w:tcBorders>
+          <w:right w:val="nil"/>
+        </w:tcBorders>
+      </w:tcPr>
+    </w:tblStylePr>
+    <w:tblStylePr w:type="seCell">
+      <w:tblPr/>
+      <w:tcPr>
+        <w:tcBorders>
+          <w:left w:val="nil"/>
+        </w:tcBorders>
+      </w:tcPr>
+    </w:tblStylePr>
+    <w:tblStylePr w:type="swCell">
+      <w:tblPr/>
+      <w:tcPr>
+        <w:tcBorders>
+          <w:right w:val="nil"/>
+        </w:tcBorders>
+      </w:tcPr>
+    </w:tblStylePr>
+  </w:style>
+  <w:style w:type="table" w:styleId="PlainTable3">
+    <w:name w:val="Plain Table 3"/>
+    <w:basedOn w:val="TableNormal"/>
+    <w:uiPriority w:val="43"/>
+    <w:rsid w:val="004207FD"/>
+    <w:pPr>
+      <w:spacing w:after="0" w:line="240" w:lineRule="auto"/>
+    </w:pPr>
+    <w:tblPr>
+      <w:tblStyleRowBandSize w:val="1"/>
+      <w:tblStyleColBandSize w:val="1"/>
+    </w:tblPr>
+    <w:tblStylePr w:type="firstRow">
+      <w:rPr>
+        <w:b/>
+        <w:bCs/>
+        <w:caps/>
+      </w:rPr>
+      <w:tblPr/>
+      <w:tcPr>
+        <w:tcBorders>
+          <w:bottom w:val="single" w:sz="4" w:space="0" w:color="7F7F7F" w:themeColor="text1" w:themeTint="80"/>
+        </w:tcBorders>
+      </w:tcPr>
+    </w:tblStylePr>
+    <w:tblStylePr w:type="lastRow">
+      <w:rPr>
+        <w:b/>
+        <w:bCs/>
+        <w:caps/>
+      </w:rPr>
+      <w:tblPr/>
+      <w:tcPr>
+        <w:tcBorders>
+          <w:top w:val="nil"/>
+        </w:tcBorders>
+      </w:tcPr>
+    </w:tblStylePr>
+    <w:tblStylePr w:type="firstCol">
+      <w:rPr>
+        <w:b/>
+        <w:bCs/>
+        <w:caps/>
+      </w:rPr>
+      <w:tblPr/>
+      <w:tcPr>
+        <w:tcBorders>
+          <w:right w:val="single" w:sz="4" w:space="0" w:color="7F7F7F" w:themeColor="text1" w:themeTint="80"/>
+        </w:tcBorders>
+      </w:tcPr>
+    </w:tblStylePr>
+    <w:tblStylePr w:type="lastCol">
+      <w:rPr>
+        <w:b/>
+        <w:bCs/>
+        <w:caps/>
+      </w:rPr>
+      <w:tblPr/>
+      <w:tcPr>
+        <w:tcBorders>
+          <w:left w:val="nil"/>
+        </w:tcBorders>
+      </w:tcPr>
+    </w:tblStylePr>
+    <w:tblStylePr w:type="band1Vert">
+      <w:tblPr/>
+      <w:tcPr>
+        <w:shd w:val="clear" w:color="auto" w:fill="F2F2F2" w:themeFill="background1" w:themeFillShade="F2"/>
+      </w:tcPr>
+    </w:tblStylePr>
+    <w:tblStylePr w:type="band1Horz">
+      <w:tblPr/>
+      <w:tcPr>
+        <w:shd w:val="clear" w:color="auto" w:fill="F2F2F2" w:themeFill="background1" w:themeFillShade="F2"/>
+      </w:tcPr>
+    </w:tblStylePr>
+    <w:tblStylePr w:type="neCell">
+      <w:tblPr/>
+      <w:tcPr>
+        <w:tcBorders>
+          <w:left w:val="nil"/>
+        </w:tcBorders>
+      </w:tcPr>
+    </w:tblStylePr>
+    <w:tblStylePr w:type="nwCell">
+      <w:tblPr/>
+      <w:tcPr>
+        <w:tcBorders>
+          <w:right w:val="nil"/>
+        </w:tcBorders>
+      </w:tcPr>
+    </w:tblStylePr>
+  </w:style>
+  <w:style w:type="table" w:styleId="PlainTable2">
+    <w:name w:val="Plain Table 2"/>
+    <w:basedOn w:val="TableNormal"/>
+    <w:uiPriority w:val="42"/>
+    <w:rsid w:val="004207FD"/>
+    <w:pPr>
+      <w:spacing w:after="0" w:line="240" w:lineRule="auto"/>
+    </w:pPr>
+    <w:tblPr>
+      <w:tblStyleRowBandSize w:val="1"/>
+      <w:tblStyleColBandSize w:val="1"/>
+      <w:tblBorders>
+        <w:top w:val="single" w:sz="4" w:space="0" w:color="7F7F7F" w:themeColor="text1" w:themeTint="80"/>
+        <w:bottom w:val="single" w:sz="4" w:space="0" w:color="7F7F7F" w:themeColor="text1" w:themeTint="80"/>
+      </w:tblBorders>
+    </w:tblPr>
+    <w:tblStylePr w:type="firstRow">
+      <w:rPr>
+        <w:b/>
+        <w:bCs/>
+      </w:rPr>
+      <w:tblPr/>
+      <w:tcPr>
+        <w:tcBorders>
+          <w:bottom w:val="single" w:sz="4" w:space="0" w:color="7F7F7F" w:themeColor="text1" w:themeTint="80"/>
+        </w:tcBorders>
+      </w:tcPr>
+    </w:tblStylePr>
+    <w:tblStylePr w:type="lastRow">
+      <w:rPr>
+        <w:b/>
+        <w:bCs/>
+      </w:rPr>
+      <w:tblPr/>
+      <w:tcPr>
+        <w:tcBorders>
+          <w:top w:val="single" w:sz="4" w:space="0" w:color="7F7F7F" w:themeColor="text1" w:themeTint="80"/>
+        </w:tcBorders>
+      </w:tcPr>
+    </w:tblStylePr>
+    <w:tblStylePr w:type="firstCol">
+      <w:rPr>
+        <w:b/>
+        <w:bCs/>
+      </w:rPr>
+    </w:tblStylePr>
+    <w:tblStylePr w:type="lastCol">
+      <w:rPr>
+        <w:b/>
+        <w:bCs/>
+      </w:rPr>
+    </w:tblStylePr>
+    <w:tblStylePr w:type="band1Vert">
+      <w:tblPr/>
+      <w:tcPr>
+        <w:tcBorders>
+          <w:left w:val="single" w:sz="4" w:space="0" w:color="7F7F7F" w:themeColor="text1" w:themeTint="80"/>
+          <w:right w:val="single" w:sz="4" w:space="0" w:color="7F7F7F" w:themeColor="text1" w:themeTint="80"/>
+        </w:tcBorders>
+      </w:tcPr>
+    </w:tblStylePr>
+    <w:tblStylePr w:type="band2Vert">
+      <w:tblPr/>
+      <w:tcPr>
+        <w:tcBorders>
+          <w:left w:val="single" w:sz="4" w:space="0" w:color="7F7F7F" w:themeColor="text1" w:themeTint="80"/>
+          <w:right w:val="single" w:sz="4" w:space="0" w:color="7F7F7F" w:themeColor="text1" w:themeTint="80"/>
+        </w:tcBorders>
+      </w:tcPr>
+    </w:tblStylePr>
+    <w:tblStylePr w:type="band1Horz">
+      <w:tblPr/>
+      <w:tcPr>
+        <w:tcBorders>
+          <w:top w:val="single" w:sz="4" w:space="0" w:color="7F7F7F" w:themeColor="text1" w:themeTint="80"/>
+          <w:bottom w:val="single" w:sz="4" w:space="0" w:color="7F7F7F" w:themeColor="text1" w:themeTint="80"/>
+        </w:tcBorders>
+      </w:tcPr>
+    </w:tblStylePr>
+  </w:style>
+  <w:style w:type="table" w:styleId="TableGridLight">
+    <w:name w:val="Grid Table Light"/>
+    <w:basedOn w:val="TableNormal"/>
+    <w:uiPriority w:val="40"/>
+    <w:rsid w:val="004207FD"/>
+    <w:pPr>
+      <w:spacing w:after="0" w:line="240" w:lineRule="auto"/>
+    </w:pPr>
+    <w:tblPr>
+      <w:tblBorders>
+        <w:top w:val="single" w:sz="4" w:space="0" w:color="BFBFBF" w:themeColor="background1" w:themeShade="BF"/>
+        <w:left w:val="single" w:sz="4" w:space="0" w:color="BFBFBF" w:themeColor="background1" w:themeShade="BF"/>
+        <w:bottom w:val="single" w:sz="4" w:space="0" w:color="BFBFBF" w:themeColor="background1" w:themeShade="BF"/>
+        <w:right w:val="single" w:sz="4" w:space="0" w:color="BFBFBF" w:themeColor="background1" w:themeShade="BF"/>
+        <w:insideH w:val="single" w:sz="4" w:space="0" w:color="BFBFBF" w:themeColor="background1" w:themeShade="BF"/>
+        <w:insideV w:val="single" w:sz="4" w:space="0" w:color="BFBFBF" w:themeColor="background1" w:themeShade="BF"/>
+      </w:tblBorders>
+    </w:tblPr>
+  </w:style>
+  <w:style w:type="paragraph" w:styleId="Caption">
+    <w:name w:val="caption"/>
+    <w:basedOn w:val="Normal"/>
+    <w:next w:val="Normal"/>
+    <w:uiPriority w:val="35"/>
+    <w:unhideWhenUsed/>
+    <w:qFormat/>
+    <w:rsid w:val="006B054C"/>
+    <w:pPr>
+      <w:spacing w:after="200" w:line="240" w:lineRule="auto"/>
+    </w:pPr>
+    <w:rPr>
+      <w:i/>
+      <w:iCs/>
+      <w:color w:val="0E2841" w:themeColor="text2"/>
+      <w:sz w:val="18"/>
+      <w:szCs w:val="18"/>
+    </w:rPr>
+  </w:style>
+  <w:style w:type="character" w:styleId="Hyperlink">
+    <w:name w:val="Hyperlink"/>
+    <w:basedOn w:val="DefaultParagraphFont"/>
+    <w:uiPriority w:val="99"/>
+    <w:unhideWhenUsed/>
+    <w:rsid w:val="009B587F"/>
+    <w:rPr>
+      <w:color w:val="467886" w:themeColor="hyperlink"/>
+      <w:u w:val="single"/>
+    </w:rPr>
+  </w:style>
+  <w:style w:type="character" w:styleId="UnresolvedMention">
+    <w:name w:val="Unresolved Mention"/>
+    <w:basedOn w:val="DefaultParagraphFont"/>
+    <w:uiPriority w:val="99"/>
+    <w:semiHidden/>
+    <w:unhideWhenUsed/>
+    <w:rsid w:val="009B587F"/>
+    <w:rPr>
+      <w:color w:val="605E5C"/>
+      <w:shd w:val="clear" w:color="auto" w:fill="E1DFDD"/>
     </w:rPr>
   </w:style>
 </w:styles>
@@ -7262,4 +11188,16 @@
     </a:ext>
   </a:extLst>
 </a:theme>
+</file>
+
+<file path=customXml/item1.xml><?xml version="1.0" encoding="utf-8"?>
+<b:Sources xmlns:b="http://schemas.openxmlformats.org/officeDocument/2006/bibliography" xmlns="http://schemas.openxmlformats.org/officeDocument/2006/bibliography" SelectedStyle="\APASixthEditionOfficeOnline.xsl" StyleName="APA" Version="6"/>
+</file>
+
+<file path=customXml/itemProps1.xml><?xml version="1.0" encoding="utf-8"?>
+<ds:datastoreItem xmlns:ds="http://schemas.openxmlformats.org/officeDocument/2006/customXml" ds:itemID="{C91F8F42-9796-466B-B288-0210BF62D955}">
+  <ds:schemaRefs>
+    <ds:schemaRef ds:uri="http://schemas.openxmlformats.org/officeDocument/2006/bibliography"/>
+  </ds:schemaRefs>
+</ds:datastoreItem>
 </file>
</xml_diff>